<commit_message>
Add heuristic CartPole baseline
</commit_message>
<xml_diff>
--- a/Отчёт_ЛР_RL_GOST.docx
+++ b/Отчёт_ЛР_RL_GOST.docx
@@ -2003,6 +2003,7 @@
       <w:tblGrid>
         <w:gridCol w:w="5000"/>
         <w:gridCol w:w="3000"/>
+        <w:gridCol w:w="2268"/>
       </w:tblGrid>
       <w:tr>
         <w:trPr>
@@ -2026,19 +2027,8 @@
             </w:tcMar>
           </w:tcPr>
           <w:p>
-            <w:pPr>
-              <w:spacing w:after="0" w:line="240" w:lineRule="auto"/>
-              <w:jc w:val="center"/>
-            </w:pPr>
-            <w:r>
-              <w:rPr>
-                <w:rFonts w:ascii="Times New Roman" w:cs="Times New Roman" w:eastAsia="Times New Roman" w:hAnsi="Times New Roman"/>
-                <w:b/>
-                <w:bCs/>
-                <w:sz w:val="24"/>
-                <w:szCs w:val="24"/>
-              </w:rPr>
-              <w:t xml:space="preserve">Метрика</w:t>
+            <w:r>
+              <w:t>???????</w:t>
             </w:r>
           </w:p>
         </w:tc>
@@ -2060,19 +2050,18 @@
             </w:tcMar>
           </w:tcPr>
           <w:p>
-            <w:pPr>
-              <w:spacing w:after="0" w:line="240" w:lineRule="auto"/>
-              <w:jc w:val="center"/>
-            </w:pPr>
-            <w:r>
-              <w:rPr>
-                <w:rFonts w:ascii="Times New Roman" w:cs="Times New Roman" w:eastAsia="Times New Roman" w:hAnsi="Times New Roman"/>
-                <w:b/>
-                <w:bCs/>
-                <w:sz w:val="24"/>
-                <w:szCs w:val="24"/>
-              </w:rPr>
-              <w:t xml:space="preserve">Значение</w:t>
+            <w:r>
+              <w:t>????????? ?????</w:t>
+            </w:r>
+          </w:p>
+        </w:tc>
+        <w:tc>
+          <w:tcPr>
+            <w:tcW w:type="dxa" w:w="2268"/>
+          </w:tcPr>
+          <w:p>
+            <w:r>
+              <w:t>????????????? ?????</w:t>
             </w:r>
           </w:p>
         </w:tc>
@@ -2095,17 +2084,8 @@
             </w:tcMar>
           </w:tcPr>
           <w:p>
-            <w:pPr>
-              <w:spacing w:after="0" w:line="240" w:lineRule="auto"/>
-              <w:jc w:val="center"/>
-            </w:pPr>
-            <w:r>
-              <w:rPr>
-                <w:rFonts w:ascii="Times New Roman" w:cs="Times New Roman" w:eastAsia="Times New Roman" w:hAnsi="Times New Roman"/>
-                <w:sz w:val="24"/>
-                <w:szCs w:val="24"/>
-              </w:rPr>
-              <w:t xml:space="preserve">Средняя суммарная награда за эпизод</w:t>
+            <w:r>
+              <w:t>??????? ????????? ??????? ?? ??????</w:t>
             </w:r>
           </w:p>
         </w:tc>
@@ -2126,17 +2106,18 @@
             </w:tcMar>
           </w:tcPr>
           <w:p>
-            <w:pPr>
-              <w:spacing w:after="0" w:line="240" w:lineRule="auto"/>
-              <w:jc w:val="center"/>
-            </w:pPr>
-            <w:r>
-              <w:rPr>
-                <w:rFonts w:ascii="Times New Roman" w:cs="Times New Roman" w:eastAsia="Times New Roman" w:hAnsi="Times New Roman"/>
-                <w:sz w:val="24"/>
-                <w:szCs w:val="24"/>
-              </w:rPr>
-              <w:t xml:space="preserve">___</w:t>
+            <w:r>
+              <w:t>___</w:t>
+            </w:r>
+          </w:p>
+        </w:tc>
+        <w:tc>
+          <w:tcPr>
+            <w:tcW w:type="dxa" w:w="2268"/>
+          </w:tcPr>
+          <w:p>
+            <w:r>
+              <w:t>___</w:t>
             </w:r>
           </w:p>
         </w:tc>
@@ -2159,17 +2140,8 @@
             </w:tcMar>
           </w:tcPr>
           <w:p>
-            <w:pPr>
-              <w:spacing w:after="0" w:line="240" w:lineRule="auto"/>
-              <w:jc w:val="center"/>
-            </w:pPr>
-            <w:r>
-              <w:rPr>
-                <w:rFonts w:ascii="Times New Roman" w:cs="Times New Roman" w:eastAsia="Times New Roman" w:hAnsi="Times New Roman"/>
-                <w:sz w:val="24"/>
-                <w:szCs w:val="24"/>
-              </w:rPr>
-              <w:t xml:space="preserve">Стандартное отклонение награды</w:t>
+            <w:r>
+              <w:t>??????????? ?????????? ???????</w:t>
             </w:r>
           </w:p>
         </w:tc>
@@ -2190,17 +2162,18 @@
             </w:tcMar>
           </w:tcPr>
           <w:p>
-            <w:pPr>
-              <w:spacing w:after="0" w:line="240" w:lineRule="auto"/>
-              <w:jc w:val="center"/>
-            </w:pPr>
-            <w:r>
-              <w:rPr>
-                <w:rFonts w:ascii="Times New Roman" w:cs="Times New Roman" w:eastAsia="Times New Roman" w:hAnsi="Times New Roman"/>
-                <w:sz w:val="24"/>
-                <w:szCs w:val="24"/>
-              </w:rPr>
-              <w:t xml:space="preserve">___</w:t>
+            <w:r>
+              <w:t>___</w:t>
+            </w:r>
+          </w:p>
+        </w:tc>
+        <w:tc>
+          <w:tcPr>
+            <w:tcW w:type="dxa" w:w="2268"/>
+          </w:tcPr>
+          <w:p>
+            <w:r>
+              <w:t>___</w:t>
             </w:r>
           </w:p>
         </w:tc>
@@ -2223,17 +2196,8 @@
             </w:tcMar>
           </w:tcPr>
           <w:p>
-            <w:pPr>
-              <w:spacing w:after="0" w:line="240" w:lineRule="auto"/>
-              <w:jc w:val="center"/>
-            </w:pPr>
-            <w:r>
-              <w:rPr>
-                <w:rFonts w:ascii="Times New Roman" w:cs="Times New Roman" w:eastAsia="Times New Roman" w:hAnsi="Times New Roman"/>
-                <w:sz w:val="24"/>
-                <w:szCs w:val="24"/>
-              </w:rPr>
-              <w:t xml:space="preserve">Минимальная награда</w:t>
+            <w:r>
+              <w:t>??????????? ???????</w:t>
             </w:r>
           </w:p>
         </w:tc>
@@ -2254,17 +2218,18 @@
             </w:tcMar>
           </w:tcPr>
           <w:p>
-            <w:pPr>
-              <w:spacing w:after="0" w:line="240" w:lineRule="auto"/>
-              <w:jc w:val="center"/>
-            </w:pPr>
-            <w:r>
-              <w:rPr>
-                <w:rFonts w:ascii="Times New Roman" w:cs="Times New Roman" w:eastAsia="Times New Roman" w:hAnsi="Times New Roman"/>
-                <w:sz w:val="24"/>
-                <w:szCs w:val="24"/>
-              </w:rPr>
-              <w:t xml:space="preserve">___</w:t>
+            <w:r>
+              <w:t>___</w:t>
+            </w:r>
+          </w:p>
+        </w:tc>
+        <w:tc>
+          <w:tcPr>
+            <w:tcW w:type="dxa" w:w="2268"/>
+          </w:tcPr>
+          <w:p>
+            <w:r>
+              <w:t>___</w:t>
             </w:r>
           </w:p>
         </w:tc>
@@ -2287,17 +2252,8 @@
             </w:tcMar>
           </w:tcPr>
           <w:p>
-            <w:pPr>
-              <w:spacing w:after="0" w:line="240" w:lineRule="auto"/>
-              <w:jc w:val="center"/>
-            </w:pPr>
-            <w:r>
-              <w:rPr>
-                <w:rFonts w:ascii="Times New Roman" w:cs="Times New Roman" w:eastAsia="Times New Roman" w:hAnsi="Times New Roman"/>
-                <w:sz w:val="24"/>
-                <w:szCs w:val="24"/>
-              </w:rPr>
-              <w:t xml:space="preserve">Максимальная награда</w:t>
+            <w:r>
+              <w:t>???????????? ???????</w:t>
             </w:r>
           </w:p>
         </w:tc>
@@ -2318,17 +2274,18 @@
             </w:tcMar>
           </w:tcPr>
           <w:p>
-            <w:pPr>
-              <w:spacing w:after="0" w:line="240" w:lineRule="auto"/>
-              <w:jc w:val="center"/>
-            </w:pPr>
-            <w:r>
-              <w:rPr>
-                <w:rFonts w:ascii="Times New Roman" w:cs="Times New Roman" w:eastAsia="Times New Roman" w:hAnsi="Times New Roman"/>
-                <w:sz w:val="24"/>
-                <w:szCs w:val="24"/>
-              </w:rPr>
-              <w:t xml:space="preserve">___</w:t>
+            <w:r>
+              <w:t>___</w:t>
+            </w:r>
+          </w:p>
+        </w:tc>
+        <w:tc>
+          <w:tcPr>
+            <w:tcW w:type="dxa" w:w="2268"/>
+          </w:tcPr>
+          <w:p>
+            <w:r>
+              <w:t>___</w:t>
             </w:r>
           </w:p>
         </w:tc>
@@ -2351,17 +2308,8 @@
             </w:tcMar>
           </w:tcPr>
           <w:p>
-            <w:pPr>
-              <w:spacing w:after="0" w:line="240" w:lineRule="auto"/>
-              <w:jc w:val="center"/>
-            </w:pPr>
-            <w:r>
-              <w:rPr>
-                <w:rFonts w:ascii="Times New Roman" w:cs="Times New Roman" w:eastAsia="Times New Roman" w:hAnsi="Times New Roman"/>
-                <w:sz w:val="24"/>
-                <w:szCs w:val="24"/>
-              </w:rPr>
-              <w:t xml:space="preserve">Доля эпизодов с наградой ≥ 100</w:t>
+            <w:r>
+              <w:t>???? ???????? ? ???????? ? 100</w:t>
             </w:r>
           </w:p>
         </w:tc>
@@ -2382,17 +2330,18 @@
             </w:tcMar>
           </w:tcPr>
           <w:p>
-            <w:pPr>
-              <w:spacing w:after="0" w:line="240" w:lineRule="auto"/>
-              <w:jc w:val="center"/>
-            </w:pPr>
-            <w:r>
-              <w:rPr>
-                <w:rFonts w:ascii="Times New Roman" w:cs="Times New Roman" w:eastAsia="Times New Roman" w:hAnsi="Times New Roman"/>
-                <w:sz w:val="24"/>
-                <w:szCs w:val="24"/>
-              </w:rPr>
-              <w:t xml:space="preserve">___ %</w:t>
+            <w:r>
+              <w:t>___ %</w:t>
+            </w:r>
+          </w:p>
+        </w:tc>
+        <w:tc>
+          <w:tcPr>
+            <w:tcW w:type="dxa" w:w="2268"/>
+          </w:tcPr>
+          <w:p>
+            <w:r>
+              <w:t>___ %</w:t>
             </w:r>
           </w:p>
         </w:tc>
@@ -2415,17 +2364,8 @@
             </w:tcMar>
           </w:tcPr>
           <w:p>
-            <w:pPr>
-              <w:spacing w:after="0" w:line="240" w:lineRule="auto"/>
-              <w:jc w:val="center"/>
-            </w:pPr>
-            <w:r>
-              <w:rPr>
-                <w:rFonts w:ascii="Times New Roman" w:cs="Times New Roman" w:eastAsia="Times New Roman" w:hAnsi="Times New Roman"/>
-                <w:sz w:val="24"/>
-                <w:szCs w:val="24"/>
-              </w:rPr>
-              <w:t xml:space="preserve">Доля эпизодов с наградой = 500 (победа)</w:t>
+            <w:r>
+              <w:t>???? ???????? ? ???????? = 500 (??????)</w:t>
             </w:r>
           </w:p>
         </w:tc>
@@ -2446,17 +2386,18 @@
             </w:tcMar>
           </w:tcPr>
           <w:p>
-            <w:pPr>
-              <w:spacing w:after="0" w:line="240" w:lineRule="auto"/>
-              <w:jc w:val="center"/>
-            </w:pPr>
-            <w:r>
-              <w:rPr>
-                <w:rFonts w:ascii="Times New Roman" w:cs="Times New Roman" w:eastAsia="Times New Roman" w:hAnsi="Times New Roman"/>
-                <w:sz w:val="24"/>
-                <w:szCs w:val="24"/>
-              </w:rPr>
-              <w:t xml:space="preserve">___ %</w:t>
+            <w:r>
+              <w:t>___ %</w:t>
+            </w:r>
+          </w:p>
+        </w:tc>
+        <w:tc>
+          <w:tcPr>
+            <w:tcW w:type="dxa" w:w="2268"/>
+          </w:tcPr>
+          <w:p>
+            <w:r>
+              <w:t>___ %</w:t>
             </w:r>
           </w:p>
         </w:tc>

</xml_diff>

<commit_message>
Fix report Cyrillic table text
</commit_message>
<xml_diff>
--- a/Отчёт_ЛР_RL_GOST.docx
+++ b/Отчёт_ЛР_RL_GOST.docx
@@ -2028,7 +2028,7 @@
           </w:tcPr>
           <w:p>
             <w:r>
-              <w:t>???????</w:t>
+              <w:t>Метрика</w:t>
             </w:r>
           </w:p>
         </w:tc>
@@ -2051,7 +2051,7 @@
           </w:tcPr>
           <w:p>
             <w:r>
-              <w:t>????????? ?????</w:t>
+              <w:t>Случайный агент</w:t>
             </w:r>
           </w:p>
         </w:tc>
@@ -2061,7 +2061,7 @@
           </w:tcPr>
           <w:p>
             <w:r>
-              <w:t>????????????? ?????</w:t>
+              <w:t>Эвристический агент</w:t>
             </w:r>
           </w:p>
         </w:tc>
@@ -2085,7 +2085,7 @@
           </w:tcPr>
           <w:p>
             <w:r>
-              <w:t>??????? ????????? ??????? ?? ??????</w:t>
+              <w:t>Средняя суммарная награда за эпизод</w:t>
             </w:r>
           </w:p>
         </w:tc>
@@ -2141,7 +2141,7 @@
           </w:tcPr>
           <w:p>
             <w:r>
-              <w:t>??????????? ?????????? ???????</w:t>
+              <w:t>Стандартное отклонение награды</w:t>
             </w:r>
           </w:p>
         </w:tc>
@@ -2197,7 +2197,7 @@
           </w:tcPr>
           <w:p>
             <w:r>
-              <w:t>??????????? ???????</w:t>
+              <w:t>Минимальная награда</w:t>
             </w:r>
           </w:p>
         </w:tc>
@@ -2253,7 +2253,7 @@
           </w:tcPr>
           <w:p>
             <w:r>
-              <w:t>???????????? ???????</w:t>
+              <w:t>Максимальная награда</w:t>
             </w:r>
           </w:p>
         </w:tc>
@@ -2309,7 +2309,7 @@
           </w:tcPr>
           <w:p>
             <w:r>
-              <w:t>???? ???????? ? ???????? ? 100</w:t>
+              <w:t>Доля эпизодов с наградой ≥ 100</w:t>
             </w:r>
           </w:p>
         </w:tc>
@@ -2365,7 +2365,7 @@
           </w:tcPr>
           <w:p>
             <w:r>
-              <w:t>???? ???????? ? ???????? = 500 (??????)</w:t>
+              <w:t>Доля эпизодов с наградой = 500 (победа)</w:t>
             </w:r>
           </w:p>
         </w:tc>

</xml_diff>

<commit_message>
Fill report tables with local results
</commit_message>
<xml_diff>
--- a/Отчёт_ЛР_RL_GOST.docx
+++ b/Отчёт_ЛР_RL_GOST.docx
@@ -1005,12 +1005,12 @@
       <w:tblPr>
         <w:tblW w:type="dxa" w:w="9000"/>
         <w:tblBorders>
-          <w:top w:val="single" w:color="auto" w:sz="4"/>
-          <w:left w:val="single" w:color="auto" w:sz="4"/>
-          <w:bottom w:val="single" w:color="auto" w:sz="4"/>
-          <w:right w:val="single" w:color="auto" w:sz="4"/>
-          <w:insideH w:val="single" w:color="auto" w:sz="4"/>
-          <w:insideV w:val="single" w:color="auto" w:sz="4"/>
+          <w:top w:val="single" w:color="000000" w:sz="6" w:space="0"/>
+          <w:left w:val="single" w:color="000000" w:sz="6" w:space="0"/>
+          <w:bottom w:val="single" w:color="000000" w:sz="6" w:space="0"/>
+          <w:right w:val="single" w:color="000000" w:sz="6" w:space="0"/>
+          <w:insideH w:val="single" w:color="000000" w:sz="6" w:space="0"/>
+          <w:insideV w:val="single" w:color="000000" w:sz="6" w:space="0"/>
         </w:tblBorders>
       </w:tblPr>
       <w:tblGrid>
@@ -1032,13 +1032,13 @@
               <w:bottom w:val="single" w:color="000000" w:sz="4"/>
               <w:right w:val="single" w:color="000000" w:sz="4"/>
             </w:tcBorders>
-            <w:shd w:fill="E7E6E6" w:val="clear"/>
-            <w:tcMar>
-              <w:top w:type="dxa" w:w="80"/>
-              <w:left w:type="dxa" w:w="100"/>
-              <w:bottom w:type="dxa" w:w="80"/>
-              <w:right w:type="dxa" w:w="100"/>
-            </w:tcMar>
+            <w:tcMar>
+              <w:top w:type="dxa" w:w="80"/>
+              <w:left w:type="dxa" w:w="100"/>
+              <w:bottom w:type="dxa" w:w="80"/>
+              <w:right w:type="dxa" w:w="100"/>
+            </w:tcMar>
+            <w:shd w:fill="D9EAF7"/>
           </w:tcPr>
           <w:p>
             <w:pPr>
@@ -1066,13 +1066,13 @@
               <w:bottom w:val="single" w:color="000000" w:sz="4"/>
               <w:right w:val="single" w:color="000000" w:sz="4"/>
             </w:tcBorders>
-            <w:shd w:fill="E7E6E6" w:val="clear"/>
-            <w:tcMar>
-              <w:top w:type="dxa" w:w="80"/>
-              <w:left w:type="dxa" w:w="100"/>
-              <w:bottom w:type="dxa" w:w="80"/>
-              <w:right w:type="dxa" w:w="100"/>
-            </w:tcMar>
+            <w:tcMar>
+              <w:top w:type="dxa" w:w="80"/>
+              <w:left w:type="dxa" w:w="100"/>
+              <w:bottom w:type="dxa" w:w="80"/>
+              <w:right w:type="dxa" w:w="100"/>
+            </w:tcMar>
+            <w:shd w:fill="D9EAF7"/>
           </w:tcPr>
           <w:p>
             <w:pPr>
@@ -1100,13 +1100,13 @@
               <w:bottom w:val="single" w:color="000000" w:sz="4"/>
               <w:right w:val="single" w:color="000000" w:sz="4"/>
             </w:tcBorders>
-            <w:shd w:fill="E7E6E6" w:val="clear"/>
-            <w:tcMar>
-              <w:top w:type="dxa" w:w="80"/>
-              <w:left w:type="dxa" w:w="100"/>
-              <w:bottom w:type="dxa" w:w="80"/>
-              <w:right w:type="dxa" w:w="100"/>
-            </w:tcMar>
+            <w:tcMar>
+              <w:top w:type="dxa" w:w="80"/>
+              <w:left w:type="dxa" w:w="100"/>
+              <w:bottom w:type="dxa" w:w="80"/>
+              <w:right w:type="dxa" w:w="100"/>
+            </w:tcMar>
+            <w:shd w:fill="D9EAF7"/>
           </w:tcPr>
           <w:p>
             <w:pPr>
@@ -1134,13 +1134,13 @@
               <w:bottom w:val="single" w:color="000000" w:sz="4"/>
               <w:right w:val="single" w:color="000000" w:sz="4"/>
             </w:tcBorders>
-            <w:shd w:fill="E7E6E6" w:val="clear"/>
-            <w:tcMar>
-              <w:top w:type="dxa" w:w="80"/>
-              <w:left w:type="dxa" w:w="100"/>
-              <w:bottom w:type="dxa" w:w="80"/>
-              <w:right w:type="dxa" w:w="100"/>
-            </w:tcMar>
+            <w:tcMar>
+              <w:top w:type="dxa" w:w="80"/>
+              <w:left w:type="dxa" w:w="100"/>
+              <w:bottom w:type="dxa" w:w="80"/>
+              <w:right w:type="dxa" w:w="100"/>
+            </w:tcMar>
+            <w:shd w:fill="D9EAF7"/>
           </w:tcPr>
           <w:p>
             <w:pPr>
@@ -1176,6 +1176,7 @@
               <w:bottom w:type="dxa" w:w="80"/>
               <w:right w:type="dxa" w:w="100"/>
             </w:tcMar>
+            <w:shd w:fill="FFFFFF"/>
           </w:tcPr>
           <w:p>
             <w:pPr>
@@ -1185,6 +1186,7 @@
             <w:r>
               <w:rPr>
                 <w:rFonts w:ascii="Times New Roman" w:cs="Times New Roman" w:eastAsia="Times New Roman" w:hAnsi="Times New Roman"/>
+                <w:b w:val="0"/>
                 <w:sz w:val="24"/>
                 <w:szCs w:val="24"/>
               </w:rPr>
@@ -1207,6 +1209,7 @@
               <w:bottom w:type="dxa" w:w="80"/>
               <w:right w:type="dxa" w:w="100"/>
             </w:tcMar>
+            <w:shd w:fill="FFFFFF"/>
           </w:tcPr>
           <w:p>
             <w:pPr>
@@ -1216,6 +1219,7 @@
             <w:r>
               <w:rPr>
                 <w:rFonts w:ascii="Times New Roman" w:cs="Times New Roman" w:eastAsia="Times New Roman" w:hAnsi="Times New Roman"/>
+                <w:b w:val="0"/>
                 <w:sz w:val="24"/>
                 <w:szCs w:val="24"/>
               </w:rPr>
@@ -1238,6 +1242,7 @@
               <w:bottom w:type="dxa" w:w="80"/>
               <w:right w:type="dxa" w:w="100"/>
             </w:tcMar>
+            <w:shd w:fill="FFFFFF"/>
           </w:tcPr>
           <w:p>
             <w:pPr>
@@ -1274,6 +1279,7 @@
               <w:bottom w:type="dxa" w:w="80"/>
               <w:right w:type="dxa" w:w="100"/>
             </w:tcMar>
+            <w:shd w:fill="FFFFFF"/>
           </w:tcPr>
           <w:p>
             <w:pPr>
@@ -1312,6 +1318,7 @@
               <w:bottom w:type="dxa" w:w="80"/>
               <w:right w:type="dxa" w:w="100"/>
             </w:tcMar>
+            <w:shd w:fill="FFFFFF"/>
           </w:tcPr>
           <w:p>
             <w:pPr>
@@ -1321,6 +1328,7 @@
             <w:r>
               <w:rPr>
                 <w:rFonts w:ascii="Times New Roman" w:cs="Times New Roman" w:eastAsia="Times New Roman" w:hAnsi="Times New Roman"/>
+                <w:b w:val="0"/>
                 <w:sz w:val="24"/>
                 <w:szCs w:val="24"/>
               </w:rPr>
@@ -1343,6 +1351,7 @@
               <w:bottom w:type="dxa" w:w="80"/>
               <w:right w:type="dxa" w:w="100"/>
             </w:tcMar>
+            <w:shd w:fill="FFFFFF"/>
           </w:tcPr>
           <w:p>
             <w:pPr>
@@ -1352,6 +1361,7 @@
             <w:r>
               <w:rPr>
                 <w:rFonts w:ascii="Times New Roman" w:cs="Times New Roman" w:eastAsia="Times New Roman" w:hAnsi="Times New Roman"/>
+                <w:b w:val="0"/>
                 <w:sz w:val="24"/>
                 <w:szCs w:val="24"/>
               </w:rPr>
@@ -1374,6 +1384,7 @@
               <w:bottom w:type="dxa" w:w="80"/>
               <w:right w:type="dxa" w:w="100"/>
             </w:tcMar>
+            <w:shd w:fill="FFFFFF"/>
           </w:tcPr>
           <w:p>
             <w:pPr>
@@ -1410,6 +1421,7 @@
               <w:bottom w:type="dxa" w:w="80"/>
               <w:right w:type="dxa" w:w="100"/>
             </w:tcMar>
+            <w:shd w:fill="FFFFFF"/>
           </w:tcPr>
           <w:p>
             <w:pPr>
@@ -1448,6 +1460,7 @@
               <w:bottom w:type="dxa" w:w="80"/>
               <w:right w:type="dxa" w:w="100"/>
             </w:tcMar>
+            <w:shd w:fill="FFFFFF"/>
           </w:tcPr>
           <w:p>
             <w:pPr>
@@ -1457,6 +1470,7 @@
             <w:r>
               <w:rPr>
                 <w:rFonts w:ascii="Times New Roman" w:cs="Times New Roman" w:eastAsia="Times New Roman" w:hAnsi="Times New Roman"/>
+                <w:b w:val="0"/>
                 <w:sz w:val="24"/>
                 <w:szCs w:val="24"/>
               </w:rPr>
@@ -1479,6 +1493,7 @@
               <w:bottom w:type="dxa" w:w="80"/>
               <w:right w:type="dxa" w:w="100"/>
             </w:tcMar>
+            <w:shd w:fill="FFFFFF"/>
           </w:tcPr>
           <w:p>
             <w:pPr>
@@ -1488,6 +1503,7 @@
             <w:r>
               <w:rPr>
                 <w:rFonts w:ascii="Times New Roman" w:cs="Times New Roman" w:eastAsia="Times New Roman" w:hAnsi="Times New Roman"/>
+                <w:b w:val="0"/>
                 <w:sz w:val="24"/>
                 <w:szCs w:val="24"/>
               </w:rPr>
@@ -1510,6 +1526,7 @@
               <w:bottom w:type="dxa" w:w="80"/>
               <w:right w:type="dxa" w:w="100"/>
             </w:tcMar>
+            <w:shd w:fill="FFFFFF"/>
           </w:tcPr>
           <w:p>
             <w:pPr>
@@ -1546,6 +1563,7 @@
               <w:bottom w:type="dxa" w:w="80"/>
               <w:right w:type="dxa" w:w="100"/>
             </w:tcMar>
+            <w:shd w:fill="FFFFFF"/>
           </w:tcPr>
           <w:p>
             <w:pPr>
@@ -1584,6 +1602,7 @@
               <w:bottom w:type="dxa" w:w="80"/>
               <w:right w:type="dxa" w:w="100"/>
             </w:tcMar>
+            <w:shd w:fill="FFFFFF"/>
           </w:tcPr>
           <w:p>
             <w:pPr>
@@ -1593,6 +1612,7 @@
             <w:r>
               <w:rPr>
                 <w:rFonts w:ascii="Times New Roman" w:cs="Times New Roman" w:eastAsia="Times New Roman" w:hAnsi="Times New Roman"/>
+                <w:b w:val="0"/>
                 <w:sz w:val="24"/>
                 <w:szCs w:val="24"/>
               </w:rPr>
@@ -1615,6 +1635,7 @@
               <w:bottom w:type="dxa" w:w="80"/>
               <w:right w:type="dxa" w:w="100"/>
             </w:tcMar>
+            <w:shd w:fill="FFFFFF"/>
           </w:tcPr>
           <w:p>
             <w:pPr>
@@ -1624,6 +1645,7 @@
             <w:r>
               <w:rPr>
                 <w:rFonts w:ascii="Times New Roman" w:cs="Times New Roman" w:eastAsia="Times New Roman" w:hAnsi="Times New Roman"/>
+                <w:b w:val="0"/>
                 <w:sz w:val="24"/>
                 <w:szCs w:val="24"/>
               </w:rPr>
@@ -1646,6 +1668,7 @@
               <w:bottom w:type="dxa" w:w="80"/>
               <w:right w:type="dxa" w:w="100"/>
             </w:tcMar>
+            <w:shd w:fill="FFFFFF"/>
           </w:tcPr>
           <w:p>
             <w:pPr>
@@ -1682,6 +1705,7 @@
               <w:bottom w:type="dxa" w:w="80"/>
               <w:right w:type="dxa" w:w="100"/>
             </w:tcMar>
+            <w:shd w:fill="FFFFFF"/>
           </w:tcPr>
           <w:p>
             <w:pPr>
@@ -1720,6 +1744,7 @@
               <w:bottom w:type="dxa" w:w="80"/>
               <w:right w:type="dxa" w:w="100"/>
             </w:tcMar>
+            <w:shd w:fill="FFFFFF"/>
           </w:tcPr>
           <w:p>
             <w:pPr>
@@ -1729,6 +1754,7 @@
             <w:r>
               <w:rPr>
                 <w:rFonts w:ascii="Times New Roman" w:cs="Times New Roman" w:eastAsia="Times New Roman" w:hAnsi="Times New Roman"/>
+                <w:b w:val="0"/>
                 <w:sz w:val="24"/>
                 <w:szCs w:val="24"/>
               </w:rPr>
@@ -1751,6 +1777,7 @@
               <w:bottom w:type="dxa" w:w="80"/>
               <w:right w:type="dxa" w:w="100"/>
             </w:tcMar>
+            <w:shd w:fill="FFFFFF"/>
           </w:tcPr>
           <w:p>
             <w:pPr>
@@ -1760,6 +1787,7 @@
             <w:r>
               <w:rPr>
                 <w:rFonts w:ascii="Times New Roman" w:cs="Times New Roman" w:eastAsia="Times New Roman" w:hAnsi="Times New Roman"/>
+                <w:b w:val="0"/>
                 <w:sz w:val="24"/>
                 <w:szCs w:val="24"/>
               </w:rPr>
@@ -1782,6 +1810,7 @@
               <w:bottom w:type="dxa" w:w="80"/>
               <w:right w:type="dxa" w:w="100"/>
             </w:tcMar>
+            <w:shd w:fill="FFFFFF"/>
           </w:tcPr>
           <w:p>
             <w:pPr>
@@ -1818,6 +1847,7 @@
               <w:bottom w:type="dxa" w:w="80"/>
               <w:right w:type="dxa" w:w="100"/>
             </w:tcMar>
+            <w:shd w:fill="FFFFFF"/>
           </w:tcPr>
           <w:p>
             <w:pPr>
@@ -1992,12 +2022,12 @@
       <w:tblPr>
         <w:tblW w:type="dxa" w:w="8000"/>
         <w:tblBorders>
-          <w:top w:val="single" w:color="auto" w:sz="4"/>
-          <w:left w:val="single" w:color="auto" w:sz="4"/>
-          <w:bottom w:val="single" w:color="auto" w:sz="4"/>
-          <w:right w:val="single" w:color="auto" w:sz="4"/>
-          <w:insideH w:val="single" w:color="auto" w:sz="4"/>
-          <w:insideV w:val="single" w:color="auto" w:sz="4"/>
+          <w:top w:val="single" w:color="000000" w:sz="6" w:space="0"/>
+          <w:left w:val="single" w:color="000000" w:sz="6" w:space="0"/>
+          <w:bottom w:val="single" w:color="000000" w:sz="6" w:space="0"/>
+          <w:right w:val="single" w:color="000000" w:sz="6" w:space="0"/>
+          <w:insideH w:val="single" w:color="000000" w:sz="6" w:space="0"/>
+          <w:insideV w:val="single" w:color="000000" w:sz="6" w:space="0"/>
         </w:tblBorders>
       </w:tblPr>
       <w:tblGrid>
@@ -2018,16 +2048,20 @@
               <w:bottom w:val="single" w:color="000000" w:sz="4"/>
               <w:right w:val="single" w:color="000000" w:sz="4"/>
             </w:tcBorders>
-            <w:shd w:fill="E7E6E6" w:val="clear"/>
-            <w:tcMar>
-              <w:top w:type="dxa" w:w="80"/>
-              <w:left w:type="dxa" w:w="100"/>
-              <w:bottom w:type="dxa" w:w="80"/>
-              <w:right w:type="dxa" w:w="100"/>
-            </w:tcMar>
-          </w:tcPr>
-          <w:p>
-            <w:r>
+            <w:tcMar>
+              <w:top w:type="dxa" w:w="80"/>
+              <w:left w:type="dxa" w:w="100"/>
+              <w:bottom w:type="dxa" w:w="80"/>
+              <w:right w:type="dxa" w:w="100"/>
+            </w:tcMar>
+            <w:shd w:fill="D9EAF7"/>
+          </w:tcPr>
+          <w:p>
+            <w:r>
+              <w:rPr>
+                <w:rFonts w:ascii="Times New Roman" w:hAnsi="Times New Roman" w:eastAsia="Times New Roman"/>
+                <w:b/>
+              </w:rPr>
               <w:t>Метрика</w:t>
             </w:r>
           </w:p>
@@ -2041,16 +2075,20 @@
               <w:bottom w:val="single" w:color="000000" w:sz="4"/>
               <w:right w:val="single" w:color="000000" w:sz="4"/>
             </w:tcBorders>
-            <w:shd w:fill="E7E6E6" w:val="clear"/>
-            <w:tcMar>
-              <w:top w:type="dxa" w:w="80"/>
-              <w:left w:type="dxa" w:w="100"/>
-              <w:bottom w:type="dxa" w:w="80"/>
-              <w:right w:type="dxa" w:w="100"/>
-            </w:tcMar>
-          </w:tcPr>
-          <w:p>
-            <w:r>
+            <w:tcMar>
+              <w:top w:type="dxa" w:w="80"/>
+              <w:left w:type="dxa" w:w="100"/>
+              <w:bottom w:type="dxa" w:w="80"/>
+              <w:right w:type="dxa" w:w="100"/>
+            </w:tcMar>
+            <w:shd w:fill="D9EAF7"/>
+          </w:tcPr>
+          <w:p>
+            <w:r>
+              <w:rPr>
+                <w:rFonts w:ascii="Times New Roman" w:hAnsi="Times New Roman" w:eastAsia="Times New Roman"/>
+                <w:b/>
+              </w:rPr>
               <w:t>Случайный агент</w:t>
             </w:r>
           </w:p>
@@ -2058,9 +2096,14 @@
         <w:tc>
           <w:tcPr>
             <w:tcW w:type="dxa" w:w="2268"/>
-          </w:tcPr>
-          <w:p>
-            <w:r>
+            <w:shd w:fill="D9EAF7"/>
+          </w:tcPr>
+          <w:p>
+            <w:r>
+              <w:rPr>
+                <w:rFonts w:ascii="Times New Roman" w:hAnsi="Times New Roman" w:eastAsia="Times New Roman"/>
+                <w:b/>
+              </w:rPr>
               <w:t>Эвристический агент</w:t>
             </w:r>
           </w:p>
@@ -2082,9 +2125,14 @@
               <w:bottom w:type="dxa" w:w="80"/>
               <w:right w:type="dxa" w:w="100"/>
             </w:tcMar>
-          </w:tcPr>
-          <w:p>
-            <w:r>
+            <w:shd w:fill="FFFFFF"/>
+          </w:tcPr>
+          <w:p>
+            <w:r>
+              <w:rPr>
+                <w:rFonts w:ascii="Times New Roman" w:hAnsi="Times New Roman" w:eastAsia="Times New Roman"/>
+                <w:b w:val="0"/>
+              </w:rPr>
               <w:t>Средняя суммарная награда за эпизод</w:t>
             </w:r>
           </w:p>
@@ -2104,20 +2152,30 @@
               <w:bottom w:type="dxa" w:w="80"/>
               <w:right w:type="dxa" w:w="100"/>
             </w:tcMar>
-          </w:tcPr>
-          <w:p>
-            <w:r>
-              <w:t>___</w:t>
+            <w:shd w:fill="FFFFFF"/>
+          </w:tcPr>
+          <w:p>
+            <w:r>
+              <w:rPr>
+                <w:rFonts w:ascii="Times New Roman" w:hAnsi="Times New Roman" w:eastAsia="Times New Roman"/>
+                <w:b w:val="0"/>
+              </w:rPr>
+              <w:t>22.50</w:t>
             </w:r>
           </w:p>
         </w:tc>
         <w:tc>
           <w:tcPr>
             <w:tcW w:type="dxa" w:w="2268"/>
-          </w:tcPr>
-          <w:p>
-            <w:r>
-              <w:t>___</w:t>
+            <w:shd w:fill="FFFFFF"/>
+          </w:tcPr>
+          <w:p>
+            <w:r>
+              <w:rPr>
+                <w:rFonts w:ascii="Times New Roman" w:hAnsi="Times New Roman" w:eastAsia="Times New Roman"/>
+                <w:b w:val="0"/>
+              </w:rPr>
+              <w:t>500.00</w:t>
             </w:r>
           </w:p>
         </w:tc>
@@ -2138,9 +2196,14 @@
               <w:bottom w:type="dxa" w:w="80"/>
               <w:right w:type="dxa" w:w="100"/>
             </w:tcMar>
-          </w:tcPr>
-          <w:p>
-            <w:r>
+            <w:shd w:fill="FFFFFF"/>
+          </w:tcPr>
+          <w:p>
+            <w:r>
+              <w:rPr>
+                <w:rFonts w:ascii="Times New Roman" w:hAnsi="Times New Roman" w:eastAsia="Times New Roman"/>
+                <w:b w:val="0"/>
+              </w:rPr>
               <w:t>Стандартное отклонение награды</w:t>
             </w:r>
           </w:p>
@@ -2160,20 +2223,30 @@
               <w:bottom w:type="dxa" w:w="80"/>
               <w:right w:type="dxa" w:w="100"/>
             </w:tcMar>
-          </w:tcPr>
-          <w:p>
-            <w:r>
-              <w:t>___</w:t>
+            <w:shd w:fill="FFFFFF"/>
+          </w:tcPr>
+          <w:p>
+            <w:r>
+              <w:rPr>
+                <w:rFonts w:ascii="Times New Roman" w:hAnsi="Times New Roman" w:eastAsia="Times New Roman"/>
+                <w:b w:val="0"/>
+              </w:rPr>
+              <w:t>12.82</w:t>
             </w:r>
           </w:p>
         </w:tc>
         <w:tc>
           <w:tcPr>
             <w:tcW w:type="dxa" w:w="2268"/>
-          </w:tcPr>
-          <w:p>
-            <w:r>
-              <w:t>___</w:t>
+            <w:shd w:fill="FFFFFF"/>
+          </w:tcPr>
+          <w:p>
+            <w:r>
+              <w:rPr>
+                <w:rFonts w:ascii="Times New Roman" w:hAnsi="Times New Roman" w:eastAsia="Times New Roman"/>
+                <w:b w:val="0"/>
+              </w:rPr>
+              <w:t>0.00</w:t>
             </w:r>
           </w:p>
         </w:tc>
@@ -2194,9 +2267,14 @@
               <w:bottom w:type="dxa" w:w="80"/>
               <w:right w:type="dxa" w:w="100"/>
             </w:tcMar>
-          </w:tcPr>
-          <w:p>
-            <w:r>
+            <w:shd w:fill="FFFFFF"/>
+          </w:tcPr>
+          <w:p>
+            <w:r>
+              <w:rPr>
+                <w:rFonts w:ascii="Times New Roman" w:hAnsi="Times New Roman" w:eastAsia="Times New Roman"/>
+                <w:b w:val="0"/>
+              </w:rPr>
               <w:t>Минимальная награда</w:t>
             </w:r>
           </w:p>
@@ -2216,20 +2294,30 @@
               <w:bottom w:type="dxa" w:w="80"/>
               <w:right w:type="dxa" w:w="100"/>
             </w:tcMar>
-          </w:tcPr>
-          <w:p>
-            <w:r>
-              <w:t>___</w:t>
+            <w:shd w:fill="FFFFFF"/>
+          </w:tcPr>
+          <w:p>
+            <w:r>
+              <w:rPr>
+                <w:rFonts w:ascii="Times New Roman" w:hAnsi="Times New Roman" w:eastAsia="Times New Roman"/>
+                <w:b w:val="0"/>
+              </w:rPr>
+              <w:t>9</w:t>
             </w:r>
           </w:p>
         </w:tc>
         <w:tc>
           <w:tcPr>
             <w:tcW w:type="dxa" w:w="2268"/>
-          </w:tcPr>
-          <w:p>
-            <w:r>
-              <w:t>___</w:t>
+            <w:shd w:fill="FFFFFF"/>
+          </w:tcPr>
+          <w:p>
+            <w:r>
+              <w:rPr>
+                <w:rFonts w:ascii="Times New Roman" w:hAnsi="Times New Roman" w:eastAsia="Times New Roman"/>
+                <w:b w:val="0"/>
+              </w:rPr>
+              <w:t>500</w:t>
             </w:r>
           </w:p>
         </w:tc>
@@ -2250,9 +2338,14 @@
               <w:bottom w:type="dxa" w:w="80"/>
               <w:right w:type="dxa" w:w="100"/>
             </w:tcMar>
-          </w:tcPr>
-          <w:p>
-            <w:r>
+            <w:shd w:fill="FFFFFF"/>
+          </w:tcPr>
+          <w:p>
+            <w:r>
+              <w:rPr>
+                <w:rFonts w:ascii="Times New Roman" w:hAnsi="Times New Roman" w:eastAsia="Times New Roman"/>
+                <w:b w:val="0"/>
+              </w:rPr>
               <w:t>Максимальная награда</w:t>
             </w:r>
           </w:p>
@@ -2272,20 +2365,30 @@
               <w:bottom w:type="dxa" w:w="80"/>
               <w:right w:type="dxa" w:w="100"/>
             </w:tcMar>
-          </w:tcPr>
-          <w:p>
-            <w:r>
-              <w:t>___</w:t>
+            <w:shd w:fill="FFFFFF"/>
+          </w:tcPr>
+          <w:p>
+            <w:r>
+              <w:rPr>
+                <w:rFonts w:ascii="Times New Roman" w:hAnsi="Times New Roman" w:eastAsia="Times New Roman"/>
+                <w:b w:val="0"/>
+              </w:rPr>
+              <w:t>124</w:t>
             </w:r>
           </w:p>
         </w:tc>
         <w:tc>
           <w:tcPr>
             <w:tcW w:type="dxa" w:w="2268"/>
-          </w:tcPr>
-          <w:p>
-            <w:r>
-              <w:t>___</w:t>
+            <w:shd w:fill="FFFFFF"/>
+          </w:tcPr>
+          <w:p>
+            <w:r>
+              <w:rPr>
+                <w:rFonts w:ascii="Times New Roman" w:hAnsi="Times New Roman" w:eastAsia="Times New Roman"/>
+                <w:b w:val="0"/>
+              </w:rPr>
+              <w:t>500</w:t>
             </w:r>
           </w:p>
         </w:tc>
@@ -2306,9 +2409,14 @@
               <w:bottom w:type="dxa" w:w="80"/>
               <w:right w:type="dxa" w:w="100"/>
             </w:tcMar>
-          </w:tcPr>
-          <w:p>
-            <w:r>
+            <w:shd w:fill="FFFFFF"/>
+          </w:tcPr>
+          <w:p>
+            <w:r>
+              <w:rPr>
+                <w:rFonts w:ascii="Times New Roman" w:hAnsi="Times New Roman" w:eastAsia="Times New Roman"/>
+                <w:b w:val="0"/>
+              </w:rPr>
               <w:t>Доля эпизодов с наградой ≥ 100</w:t>
             </w:r>
           </w:p>
@@ -2328,20 +2436,30 @@
               <w:bottom w:type="dxa" w:w="80"/>
               <w:right w:type="dxa" w:w="100"/>
             </w:tcMar>
-          </w:tcPr>
-          <w:p>
-            <w:r>
-              <w:t>___ %</w:t>
+            <w:shd w:fill="FFFFFF"/>
+          </w:tcPr>
+          <w:p>
+            <w:r>
+              <w:rPr>
+                <w:rFonts w:ascii="Times New Roman" w:hAnsi="Times New Roman" w:eastAsia="Times New Roman"/>
+                <w:b w:val="0"/>
+              </w:rPr>
+              <w:t>0.5 %</w:t>
             </w:r>
           </w:p>
         </w:tc>
         <w:tc>
           <w:tcPr>
             <w:tcW w:type="dxa" w:w="2268"/>
-          </w:tcPr>
-          <w:p>
-            <w:r>
-              <w:t>___ %</w:t>
+            <w:shd w:fill="FFFFFF"/>
+          </w:tcPr>
+          <w:p>
+            <w:r>
+              <w:rPr>
+                <w:rFonts w:ascii="Times New Roman" w:hAnsi="Times New Roman" w:eastAsia="Times New Roman"/>
+                <w:b w:val="0"/>
+              </w:rPr>
+              <w:t>100.0 %</w:t>
             </w:r>
           </w:p>
         </w:tc>
@@ -2362,9 +2480,14 @@
               <w:bottom w:type="dxa" w:w="80"/>
               <w:right w:type="dxa" w:w="100"/>
             </w:tcMar>
-          </w:tcPr>
-          <w:p>
-            <w:r>
+            <w:shd w:fill="FFFFFF"/>
+          </w:tcPr>
+          <w:p>
+            <w:r>
+              <w:rPr>
+                <w:rFonts w:ascii="Times New Roman" w:hAnsi="Times New Roman" w:eastAsia="Times New Roman"/>
+                <w:b w:val="0"/>
+              </w:rPr>
               <w:t>Доля эпизодов с наградой = 500 (победа)</w:t>
             </w:r>
           </w:p>
@@ -2384,20 +2507,30 @@
               <w:bottom w:type="dxa" w:w="80"/>
               <w:right w:type="dxa" w:w="100"/>
             </w:tcMar>
-          </w:tcPr>
-          <w:p>
-            <w:r>
-              <w:t>___ %</w:t>
+            <w:shd w:fill="FFFFFF"/>
+          </w:tcPr>
+          <w:p>
+            <w:r>
+              <w:rPr>
+                <w:rFonts w:ascii="Times New Roman" w:hAnsi="Times New Roman" w:eastAsia="Times New Roman"/>
+                <w:b w:val="0"/>
+              </w:rPr>
+              <w:t>0.0 %</w:t>
             </w:r>
           </w:p>
         </w:tc>
         <w:tc>
           <w:tcPr>
             <w:tcW w:type="dxa" w:w="2268"/>
-          </w:tcPr>
-          <w:p>
-            <w:r>
-              <w:t>___ %</w:t>
+            <w:shd w:fill="FFFFFF"/>
+          </w:tcPr>
+          <w:p>
+            <w:r>
+              <w:rPr>
+                <w:rFonts w:ascii="Times New Roman" w:hAnsi="Times New Roman" w:eastAsia="Times New Roman"/>
+                <w:b w:val="0"/>
+              </w:rPr>
+              <w:t>100.0 %</w:t>
             </w:r>
           </w:p>
         </w:tc>
@@ -2521,12 +2654,12 @@
       <w:tblPr>
         <w:tblW w:type="dxa" w:w="9000"/>
         <w:tblBorders>
-          <w:top w:val="single" w:color="auto" w:sz="4"/>
-          <w:left w:val="single" w:color="auto" w:sz="4"/>
-          <w:bottom w:val="single" w:color="auto" w:sz="4"/>
-          <w:right w:val="single" w:color="auto" w:sz="4"/>
-          <w:insideH w:val="single" w:color="auto" w:sz="4"/>
-          <w:insideV w:val="single" w:color="auto" w:sz="4"/>
+          <w:top w:val="single" w:color="000000" w:sz="6" w:space="0"/>
+          <w:left w:val="single" w:color="000000" w:sz="6" w:space="0"/>
+          <w:bottom w:val="single" w:color="000000" w:sz="6" w:space="0"/>
+          <w:right w:val="single" w:color="000000" w:sz="6" w:space="0"/>
+          <w:insideH w:val="single" w:color="000000" w:sz="6" w:space="0"/>
+          <w:insideV w:val="single" w:color="000000" w:sz="6" w:space="0"/>
         </w:tblBorders>
       </w:tblPr>
       <w:tblGrid>
@@ -2548,28 +2681,21 @@
               <w:bottom w:val="single" w:color="000000" w:sz="4"/>
               <w:right w:val="single" w:color="000000" w:sz="4"/>
             </w:tcBorders>
-            <w:shd w:fill="E7E6E6" w:val="clear"/>
-            <w:tcMar>
-              <w:top w:type="dxa" w:w="80"/>
-              <w:left w:type="dxa" w:w="100"/>
-              <w:bottom w:type="dxa" w:w="80"/>
-              <w:right w:type="dxa" w:w="100"/>
-            </w:tcMar>
-          </w:tcPr>
-          <w:p>
-            <w:pPr>
-              <w:spacing w:after="0" w:line="240" w:lineRule="auto"/>
-              <w:jc w:val="center"/>
-            </w:pPr>
-            <w:r>
-              <w:rPr>
-                <w:rFonts w:ascii="Times New Roman" w:cs="Times New Roman" w:eastAsia="Times New Roman" w:hAnsi="Times New Roman"/>
+            <w:tcMar>
+              <w:top w:type="dxa" w:w="80"/>
+              <w:left w:type="dxa" w:w="100"/>
+              <w:bottom w:type="dxa" w:w="80"/>
+              <w:right w:type="dxa" w:w="100"/>
+            </w:tcMar>
+            <w:shd w:fill="D9EAF7"/>
+          </w:tcPr>
+          <w:p>
+            <w:r>
+              <w:rPr>
+                <w:rFonts w:ascii="Times New Roman" w:hAnsi="Times New Roman" w:eastAsia="Times New Roman"/>
                 <w:b/>
-                <w:bCs/>
-                <w:sz w:val="24"/>
-                <w:szCs w:val="24"/>
-              </w:rPr>
-              <w:t xml:space="preserve">Итерация</w:t>
+              </w:rPr>
+              <w:t>Итерация</w:t>
             </w:r>
           </w:p>
         </w:tc>
@@ -2582,28 +2708,21 @@
               <w:bottom w:val="single" w:color="000000" w:sz="4"/>
               <w:right w:val="single" w:color="000000" w:sz="4"/>
             </w:tcBorders>
-            <w:shd w:fill="E7E6E6" w:val="clear"/>
-            <w:tcMar>
-              <w:top w:type="dxa" w:w="80"/>
-              <w:left w:type="dxa" w:w="100"/>
-              <w:bottom w:type="dxa" w:w="80"/>
-              <w:right w:type="dxa" w:w="100"/>
-            </w:tcMar>
-          </w:tcPr>
-          <w:p>
-            <w:pPr>
-              <w:spacing w:after="0" w:line="240" w:lineRule="auto"/>
-              <w:jc w:val="center"/>
-            </w:pPr>
-            <w:r>
-              <w:rPr>
-                <w:rFonts w:ascii="Times New Roman" w:cs="Times New Roman" w:eastAsia="Times New Roman" w:hAnsi="Times New Roman"/>
+            <w:tcMar>
+              <w:top w:type="dxa" w:w="80"/>
+              <w:left w:type="dxa" w:w="100"/>
+              <w:bottom w:type="dxa" w:w="80"/>
+              <w:right w:type="dxa" w:w="100"/>
+            </w:tcMar>
+            <w:shd w:fill="D9EAF7"/>
+          </w:tcPr>
+          <w:p>
+            <w:r>
+              <w:rPr>
+                <w:rFonts w:ascii="Times New Roman" w:hAnsi="Times New Roman" w:eastAsia="Times New Roman"/>
                 <w:b/>
-                <w:bCs/>
-                <w:sz w:val="24"/>
-                <w:szCs w:val="24"/>
-              </w:rPr>
-              <w:t xml:space="preserve">Средняя награда</w:t>
+              </w:rPr>
+              <w:t>Средняя награда</w:t>
             </w:r>
           </w:p>
         </w:tc>
@@ -2616,28 +2735,21 @@
               <w:bottom w:val="single" w:color="000000" w:sz="4"/>
               <w:right w:val="single" w:color="000000" w:sz="4"/>
             </w:tcBorders>
-            <w:shd w:fill="E7E6E6" w:val="clear"/>
-            <w:tcMar>
-              <w:top w:type="dxa" w:w="80"/>
-              <w:left w:type="dxa" w:w="100"/>
-              <w:bottom w:type="dxa" w:w="80"/>
-              <w:right w:type="dxa" w:w="100"/>
-            </w:tcMar>
-          </w:tcPr>
-          <w:p>
-            <w:pPr>
-              <w:spacing w:after="0" w:line="240" w:lineRule="auto"/>
-              <w:jc w:val="center"/>
-            </w:pPr>
-            <w:r>
-              <w:rPr>
-                <w:rFonts w:ascii="Times New Roman" w:cs="Times New Roman" w:eastAsia="Times New Roman" w:hAnsi="Times New Roman"/>
+            <w:tcMar>
+              <w:top w:type="dxa" w:w="80"/>
+              <w:left w:type="dxa" w:w="100"/>
+              <w:bottom w:type="dxa" w:w="80"/>
+              <w:right w:type="dxa" w:w="100"/>
+            </w:tcMar>
+            <w:shd w:fill="D9EAF7"/>
+          </w:tcPr>
+          <w:p>
+            <w:r>
+              <w:rPr>
+                <w:rFonts w:ascii="Times New Roman" w:hAnsi="Times New Roman" w:eastAsia="Times New Roman"/>
                 <w:b/>
-                <w:bCs/>
-                <w:sz w:val="24"/>
-                <w:szCs w:val="24"/>
-              </w:rPr>
-              <w:t xml:space="preserve">Порог элиты</w:t>
+              </w:rPr>
+              <w:t>Порог элиты</w:t>
             </w:r>
           </w:p>
         </w:tc>
@@ -2650,28 +2762,21 @@
               <w:bottom w:val="single" w:color="000000" w:sz="4"/>
               <w:right w:val="single" w:color="000000" w:sz="4"/>
             </w:tcBorders>
-            <w:shd w:fill="E7E6E6" w:val="clear"/>
-            <w:tcMar>
-              <w:top w:type="dxa" w:w="80"/>
-              <w:left w:type="dxa" w:w="100"/>
-              <w:bottom w:type="dxa" w:w="80"/>
-              <w:right w:type="dxa" w:w="100"/>
-            </w:tcMar>
-          </w:tcPr>
-          <w:p>
-            <w:pPr>
-              <w:spacing w:after="0" w:line="240" w:lineRule="auto"/>
-              <w:jc w:val="center"/>
-            </w:pPr>
-            <w:r>
-              <w:rPr>
-                <w:rFonts w:ascii="Times New Roman" w:cs="Times New Roman" w:eastAsia="Times New Roman" w:hAnsi="Times New Roman"/>
+            <w:tcMar>
+              <w:top w:type="dxa" w:w="80"/>
+              <w:left w:type="dxa" w:w="100"/>
+              <w:bottom w:type="dxa" w:w="80"/>
+              <w:right w:type="dxa" w:w="100"/>
+            </w:tcMar>
+            <w:shd w:fill="D9EAF7"/>
+          </w:tcPr>
+          <w:p>
+            <w:r>
+              <w:rPr>
+                <w:rFonts w:ascii="Times New Roman" w:hAnsi="Times New Roman" w:eastAsia="Times New Roman"/>
                 <w:b/>
-                <w:bCs/>
-                <w:sz w:val="24"/>
-                <w:szCs w:val="24"/>
-              </w:rPr>
-              <w:t xml:space="preserve">Loss</w:t>
+              </w:rPr>
+              <w:t>Loss</w:t>
             </w:r>
           </w:p>
         </w:tc>
@@ -2692,19 +2797,15 @@
               <w:bottom w:type="dxa" w:w="80"/>
               <w:right w:type="dxa" w:w="100"/>
             </w:tcMar>
-          </w:tcPr>
-          <w:p>
-            <w:pPr>
-              <w:spacing w:after="0" w:line="240" w:lineRule="auto"/>
-              <w:jc w:val="center"/>
-            </w:pPr>
-            <w:r>
-              <w:rPr>
-                <w:rFonts w:ascii="Times New Roman" w:cs="Times New Roman" w:eastAsia="Times New Roman" w:hAnsi="Times New Roman"/>
-                <w:sz w:val="24"/>
-                <w:szCs w:val="24"/>
-              </w:rPr>
-              <w:t xml:space="preserve">1</w:t>
+            <w:shd w:fill="FFFFFF"/>
+          </w:tcPr>
+          <w:p>
+            <w:r>
+              <w:rPr>
+                <w:rFonts w:ascii="Times New Roman" w:hAnsi="Times New Roman" w:eastAsia="Times New Roman"/>
+                <w:b w:val="0"/>
+              </w:rPr>
+              <w:t>1</w:t>
             </w:r>
           </w:p>
         </w:tc>
@@ -2723,19 +2824,15 @@
               <w:bottom w:type="dxa" w:w="80"/>
               <w:right w:type="dxa" w:w="100"/>
             </w:tcMar>
-          </w:tcPr>
-          <w:p>
-            <w:pPr>
-              <w:spacing w:after="0" w:line="240" w:lineRule="auto"/>
-              <w:jc w:val="center"/>
-            </w:pPr>
-            <w:r>
-              <w:rPr>
-                <w:rFonts w:ascii="Times New Roman" w:cs="Times New Roman" w:eastAsia="Times New Roman" w:hAnsi="Times New Roman"/>
-                <w:sz w:val="24"/>
-                <w:szCs w:val="24"/>
-              </w:rPr>
-              <w:t xml:space="preserve">___</w:t>
+            <w:shd w:fill="FFFFFF"/>
+          </w:tcPr>
+          <w:p>
+            <w:r>
+              <w:rPr>
+                <w:rFonts w:ascii="Times New Roman" w:hAnsi="Times New Roman" w:eastAsia="Times New Roman"/>
+                <w:b w:val="0"/>
+              </w:rPr>
+              <w:t>22.81</w:t>
             </w:r>
           </w:p>
         </w:tc>
@@ -2754,19 +2851,15 @@
               <w:bottom w:type="dxa" w:w="80"/>
               <w:right w:type="dxa" w:w="100"/>
             </w:tcMar>
-          </w:tcPr>
-          <w:p>
-            <w:pPr>
-              <w:spacing w:after="0" w:line="240" w:lineRule="auto"/>
-              <w:jc w:val="center"/>
-            </w:pPr>
-            <w:r>
-              <w:rPr>
-                <w:rFonts w:ascii="Times New Roman" w:cs="Times New Roman" w:eastAsia="Times New Roman" w:hAnsi="Times New Roman"/>
-                <w:sz w:val="24"/>
-                <w:szCs w:val="24"/>
-              </w:rPr>
-              <w:t xml:space="preserve">___</w:t>
+            <w:shd w:fill="FFFFFF"/>
+          </w:tcPr>
+          <w:p>
+            <w:r>
+              <w:rPr>
+                <w:rFonts w:ascii="Times New Roman" w:hAnsi="Times New Roman" w:eastAsia="Times New Roman"/>
+                <w:b w:val="0"/>
+              </w:rPr>
+              <w:t>28.00</w:t>
             </w:r>
           </w:p>
         </w:tc>
@@ -2785,19 +2878,15 @@
               <w:bottom w:type="dxa" w:w="80"/>
               <w:right w:type="dxa" w:w="100"/>
             </w:tcMar>
-          </w:tcPr>
-          <w:p>
-            <w:pPr>
-              <w:spacing w:after="0" w:line="240" w:lineRule="auto"/>
-              <w:jc w:val="center"/>
-            </w:pPr>
-            <w:r>
-              <w:rPr>
-                <w:rFonts w:ascii="Times New Roman" w:cs="Times New Roman" w:eastAsia="Times New Roman" w:hAnsi="Times New Roman"/>
-                <w:sz w:val="24"/>
-                <w:szCs w:val="24"/>
-              </w:rPr>
-              <w:t xml:space="preserve">___</w:t>
+            <w:shd w:fill="FFFFFF"/>
+          </w:tcPr>
+          <w:p>
+            <w:r>
+              <w:rPr>
+                <w:rFonts w:ascii="Times New Roman" w:hAnsi="Times New Roman" w:eastAsia="Times New Roman"/>
+                <w:b w:val="0"/>
+              </w:rPr>
+              <w:t>0.7099</w:t>
             </w:r>
           </w:p>
         </w:tc>
@@ -2818,19 +2907,15 @@
               <w:bottom w:type="dxa" w:w="80"/>
               <w:right w:type="dxa" w:w="100"/>
             </w:tcMar>
-          </w:tcPr>
-          <w:p>
-            <w:pPr>
-              <w:spacing w:after="0" w:line="240" w:lineRule="auto"/>
-              <w:jc w:val="center"/>
-            </w:pPr>
-            <w:r>
-              <w:rPr>
-                <w:rFonts w:ascii="Times New Roman" w:cs="Times New Roman" w:eastAsia="Times New Roman" w:hAnsi="Times New Roman"/>
-                <w:sz w:val="24"/>
-                <w:szCs w:val="24"/>
-              </w:rPr>
-              <w:t xml:space="preserve">10</w:t>
+            <w:shd w:fill="FFFFFF"/>
+          </w:tcPr>
+          <w:p>
+            <w:r>
+              <w:rPr>
+                <w:rFonts w:ascii="Times New Roman" w:hAnsi="Times New Roman" w:eastAsia="Times New Roman"/>
+                <w:b w:val="0"/>
+              </w:rPr>
+              <w:t>10</w:t>
             </w:r>
           </w:p>
         </w:tc>
@@ -2849,19 +2934,15 @@
               <w:bottom w:type="dxa" w:w="80"/>
               <w:right w:type="dxa" w:w="100"/>
             </w:tcMar>
-          </w:tcPr>
-          <w:p>
-            <w:pPr>
-              <w:spacing w:after="0" w:line="240" w:lineRule="auto"/>
-              <w:jc w:val="center"/>
-            </w:pPr>
-            <w:r>
-              <w:rPr>
-                <w:rFonts w:ascii="Times New Roman" w:cs="Times New Roman" w:eastAsia="Times New Roman" w:hAnsi="Times New Roman"/>
-                <w:sz w:val="24"/>
-                <w:szCs w:val="24"/>
-              </w:rPr>
-              <w:t xml:space="preserve">___</w:t>
+            <w:shd w:fill="FFFFFF"/>
+          </w:tcPr>
+          <w:p>
+            <w:r>
+              <w:rPr>
+                <w:rFonts w:ascii="Times New Roman" w:hAnsi="Times New Roman" w:eastAsia="Times New Roman"/>
+                <w:b w:val="0"/>
+              </w:rPr>
+              <w:t>55.12</w:t>
             </w:r>
           </w:p>
         </w:tc>
@@ -2880,19 +2961,15 @@
               <w:bottom w:type="dxa" w:w="80"/>
               <w:right w:type="dxa" w:w="100"/>
             </w:tcMar>
-          </w:tcPr>
-          <w:p>
-            <w:pPr>
-              <w:spacing w:after="0" w:line="240" w:lineRule="auto"/>
-              <w:jc w:val="center"/>
-            </w:pPr>
-            <w:r>
-              <w:rPr>
-                <w:rFonts w:ascii="Times New Roman" w:cs="Times New Roman" w:eastAsia="Times New Roman" w:hAnsi="Times New Roman"/>
-                <w:sz w:val="24"/>
-                <w:szCs w:val="24"/>
-              </w:rPr>
-              <w:t xml:space="preserve">___</w:t>
+            <w:shd w:fill="FFFFFF"/>
+          </w:tcPr>
+          <w:p>
+            <w:r>
+              <w:rPr>
+                <w:rFonts w:ascii="Times New Roman" w:hAnsi="Times New Roman" w:eastAsia="Times New Roman"/>
+                <w:b w:val="0"/>
+              </w:rPr>
+              <w:t>66.00</w:t>
             </w:r>
           </w:p>
         </w:tc>
@@ -2911,19 +2988,15 @@
               <w:bottom w:type="dxa" w:w="80"/>
               <w:right w:type="dxa" w:w="100"/>
             </w:tcMar>
-          </w:tcPr>
-          <w:p>
-            <w:pPr>
-              <w:spacing w:after="0" w:line="240" w:lineRule="auto"/>
-              <w:jc w:val="center"/>
-            </w:pPr>
-            <w:r>
-              <w:rPr>
-                <w:rFonts w:ascii="Times New Roman" w:cs="Times New Roman" w:eastAsia="Times New Roman" w:hAnsi="Times New Roman"/>
-                <w:sz w:val="24"/>
-                <w:szCs w:val="24"/>
-              </w:rPr>
-              <w:t xml:space="preserve">___</w:t>
+            <w:shd w:fill="FFFFFF"/>
+          </w:tcPr>
+          <w:p>
+            <w:r>
+              <w:rPr>
+                <w:rFonts w:ascii="Times New Roman" w:hAnsi="Times New Roman" w:eastAsia="Times New Roman"/>
+                <w:b w:val="0"/>
+              </w:rPr>
+              <w:t>0.6220</w:t>
             </w:r>
           </w:p>
         </w:tc>
@@ -2944,19 +3017,15 @@
               <w:bottom w:type="dxa" w:w="80"/>
               <w:right w:type="dxa" w:w="100"/>
             </w:tcMar>
-          </w:tcPr>
-          <w:p>
-            <w:pPr>
-              <w:spacing w:after="0" w:line="240" w:lineRule="auto"/>
-              <w:jc w:val="center"/>
-            </w:pPr>
-            <w:r>
-              <w:rPr>
-                <w:rFonts w:ascii="Times New Roman" w:cs="Times New Roman" w:eastAsia="Times New Roman" w:hAnsi="Times New Roman"/>
-                <w:sz w:val="24"/>
-                <w:szCs w:val="24"/>
-              </w:rPr>
-              <w:t xml:space="preserve">20</w:t>
+            <w:shd w:fill="FFFFFF"/>
+          </w:tcPr>
+          <w:p>
+            <w:r>
+              <w:rPr>
+                <w:rFonts w:ascii="Times New Roman" w:hAnsi="Times New Roman" w:eastAsia="Times New Roman"/>
+                <w:b w:val="0"/>
+              </w:rPr>
+              <w:t>20</w:t>
             </w:r>
           </w:p>
         </w:tc>
@@ -2975,19 +3044,15 @@
               <w:bottom w:type="dxa" w:w="80"/>
               <w:right w:type="dxa" w:w="100"/>
             </w:tcMar>
-          </w:tcPr>
-          <w:p>
-            <w:pPr>
-              <w:spacing w:after="0" w:line="240" w:lineRule="auto"/>
-              <w:jc w:val="center"/>
-            </w:pPr>
-            <w:r>
-              <w:rPr>
-                <w:rFonts w:ascii="Times New Roman" w:cs="Times New Roman" w:eastAsia="Times New Roman" w:hAnsi="Times New Roman"/>
-                <w:sz w:val="24"/>
-                <w:szCs w:val="24"/>
-              </w:rPr>
-              <w:t xml:space="preserve">___</w:t>
+            <w:shd w:fill="FFFFFF"/>
+          </w:tcPr>
+          <w:p>
+            <w:r>
+              <w:rPr>
+                <w:rFonts w:ascii="Times New Roman" w:hAnsi="Times New Roman" w:eastAsia="Times New Roman"/>
+                <w:b w:val="0"/>
+              </w:rPr>
+              <w:t>73.06</w:t>
             </w:r>
           </w:p>
         </w:tc>
@@ -3006,19 +3071,15 @@
               <w:bottom w:type="dxa" w:w="80"/>
               <w:right w:type="dxa" w:w="100"/>
             </w:tcMar>
-          </w:tcPr>
-          <w:p>
-            <w:pPr>
-              <w:spacing w:after="0" w:line="240" w:lineRule="auto"/>
-              <w:jc w:val="center"/>
-            </w:pPr>
-            <w:r>
-              <w:rPr>
-                <w:rFonts w:ascii="Times New Roman" w:cs="Times New Roman" w:eastAsia="Times New Roman" w:hAnsi="Times New Roman"/>
-                <w:sz w:val="24"/>
-                <w:szCs w:val="24"/>
-              </w:rPr>
-              <w:t xml:space="preserve">___</w:t>
+            <w:shd w:fill="FFFFFF"/>
+          </w:tcPr>
+          <w:p>
+            <w:r>
+              <w:rPr>
+                <w:rFonts w:ascii="Times New Roman" w:hAnsi="Times New Roman" w:eastAsia="Times New Roman"/>
+                <w:b w:val="0"/>
+              </w:rPr>
+              <w:t>85.50</w:t>
             </w:r>
           </w:p>
         </w:tc>
@@ -3037,19 +3098,15 @@
               <w:bottom w:type="dxa" w:w="80"/>
               <w:right w:type="dxa" w:w="100"/>
             </w:tcMar>
-          </w:tcPr>
-          <w:p>
-            <w:pPr>
-              <w:spacing w:after="0" w:line="240" w:lineRule="auto"/>
-              <w:jc w:val="center"/>
-            </w:pPr>
-            <w:r>
-              <w:rPr>
-                <w:rFonts w:ascii="Times New Roman" w:cs="Times New Roman" w:eastAsia="Times New Roman" w:hAnsi="Times New Roman"/>
-                <w:sz w:val="24"/>
-                <w:szCs w:val="24"/>
-              </w:rPr>
-              <w:t xml:space="preserve">___</w:t>
+            <w:shd w:fill="FFFFFF"/>
+          </w:tcPr>
+          <w:p>
+            <w:r>
+              <w:rPr>
+                <w:rFonts w:ascii="Times New Roman" w:hAnsi="Times New Roman" w:eastAsia="Times New Roman"/>
+                <w:b w:val="0"/>
+              </w:rPr>
+              <w:t>0.5427</w:t>
             </w:r>
           </w:p>
         </w:tc>
@@ -3070,19 +3127,15 @@
               <w:bottom w:type="dxa" w:w="80"/>
               <w:right w:type="dxa" w:w="100"/>
             </w:tcMar>
-          </w:tcPr>
-          <w:p>
-            <w:pPr>
-              <w:spacing w:after="0" w:line="240" w:lineRule="auto"/>
-              <w:jc w:val="center"/>
-            </w:pPr>
-            <w:r>
-              <w:rPr>
-                <w:rFonts w:ascii="Times New Roman" w:cs="Times New Roman" w:eastAsia="Times New Roman" w:hAnsi="Times New Roman"/>
-                <w:sz w:val="24"/>
-                <w:szCs w:val="24"/>
-              </w:rPr>
-              <w:t xml:space="preserve">30</w:t>
+            <w:shd w:fill="FFFFFF"/>
+          </w:tcPr>
+          <w:p>
+            <w:r>
+              <w:rPr>
+                <w:rFonts w:ascii="Times New Roman" w:hAnsi="Times New Roman" w:eastAsia="Times New Roman"/>
+                <w:b w:val="0"/>
+              </w:rPr>
+              <w:t>30</w:t>
             </w:r>
           </w:p>
         </w:tc>
@@ -3101,19 +3154,15 @@
               <w:bottom w:type="dxa" w:w="80"/>
               <w:right w:type="dxa" w:w="100"/>
             </w:tcMar>
-          </w:tcPr>
-          <w:p>
-            <w:pPr>
-              <w:spacing w:after="0" w:line="240" w:lineRule="auto"/>
-              <w:jc w:val="center"/>
-            </w:pPr>
-            <w:r>
-              <w:rPr>
-                <w:rFonts w:ascii="Times New Roman" w:cs="Times New Roman" w:eastAsia="Times New Roman" w:hAnsi="Times New Roman"/>
-                <w:sz w:val="24"/>
-                <w:szCs w:val="24"/>
-              </w:rPr>
-              <w:t xml:space="preserve">___</w:t>
+            <w:shd w:fill="FFFFFF"/>
+          </w:tcPr>
+          <w:p>
+            <w:r>
+              <w:rPr>
+                <w:rFonts w:ascii="Times New Roman" w:hAnsi="Times New Roman" w:eastAsia="Times New Roman"/>
+                <w:b w:val="0"/>
+              </w:rPr>
+              <w:t>94.81</w:t>
             </w:r>
           </w:p>
         </w:tc>
@@ -3132,19 +3181,15 @@
               <w:bottom w:type="dxa" w:w="80"/>
               <w:right w:type="dxa" w:w="100"/>
             </w:tcMar>
-          </w:tcPr>
-          <w:p>
-            <w:pPr>
-              <w:spacing w:after="0" w:line="240" w:lineRule="auto"/>
-              <w:jc w:val="center"/>
-            </w:pPr>
-            <w:r>
-              <w:rPr>
-                <w:rFonts w:ascii="Times New Roman" w:cs="Times New Roman" w:eastAsia="Times New Roman" w:hAnsi="Times New Roman"/>
-                <w:sz w:val="24"/>
-                <w:szCs w:val="24"/>
-              </w:rPr>
-              <w:t xml:space="preserve">___</w:t>
+            <w:shd w:fill="FFFFFF"/>
+          </w:tcPr>
+          <w:p>
+            <w:r>
+              <w:rPr>
+                <w:rFonts w:ascii="Times New Roman" w:hAnsi="Times New Roman" w:eastAsia="Times New Roman"/>
+                <w:b w:val="0"/>
+              </w:rPr>
+              <w:t>106.00</w:t>
             </w:r>
           </w:p>
         </w:tc>
@@ -3163,19 +3208,15 @@
               <w:bottom w:type="dxa" w:w="80"/>
               <w:right w:type="dxa" w:w="100"/>
             </w:tcMar>
-          </w:tcPr>
-          <w:p>
-            <w:pPr>
-              <w:spacing w:after="0" w:line="240" w:lineRule="auto"/>
-              <w:jc w:val="center"/>
-            </w:pPr>
-            <w:r>
-              <w:rPr>
-                <w:rFonts w:ascii="Times New Roman" w:cs="Times New Roman" w:eastAsia="Times New Roman" w:hAnsi="Times New Roman"/>
-                <w:sz w:val="24"/>
-                <w:szCs w:val="24"/>
-              </w:rPr>
-              <w:t xml:space="preserve">___</w:t>
+            <w:shd w:fill="FFFFFF"/>
+          </w:tcPr>
+          <w:p>
+            <w:r>
+              <w:rPr>
+                <w:rFonts w:ascii="Times New Roman" w:hAnsi="Times New Roman" w:eastAsia="Times New Roman"/>
+                <w:b w:val="0"/>
+              </w:rPr>
+              <w:t>0.4963</w:t>
             </w:r>
           </w:p>
         </w:tc>
@@ -3196,19 +3237,15 @@
               <w:bottom w:type="dxa" w:w="80"/>
               <w:right w:type="dxa" w:w="100"/>
             </w:tcMar>
-          </w:tcPr>
-          <w:p>
-            <w:pPr>
-              <w:spacing w:after="0" w:line="240" w:lineRule="auto"/>
-              <w:jc w:val="center"/>
-            </w:pPr>
-            <w:r>
-              <w:rPr>
-                <w:rFonts w:ascii="Times New Roman" w:cs="Times New Roman" w:eastAsia="Times New Roman" w:hAnsi="Times New Roman"/>
-                <w:sz w:val="24"/>
-                <w:szCs w:val="24"/>
-              </w:rPr>
-              <w:t xml:space="preserve">Финальная</w:t>
+            <w:shd w:fill="FFFFFF"/>
+          </w:tcPr>
+          <w:p>
+            <w:r>
+              <w:rPr>
+                <w:rFonts w:ascii="Times New Roman" w:hAnsi="Times New Roman" w:eastAsia="Times New Roman"/>
+                <w:b w:val="0"/>
+              </w:rPr>
+              <w:t>Финальная</w:t>
             </w:r>
           </w:p>
         </w:tc>
@@ -3227,19 +3264,15 @@
               <w:bottom w:type="dxa" w:w="80"/>
               <w:right w:type="dxa" w:w="100"/>
             </w:tcMar>
-          </w:tcPr>
-          <w:p>
-            <w:pPr>
-              <w:spacing w:after="0" w:line="240" w:lineRule="auto"/>
-              <w:jc w:val="center"/>
-            </w:pPr>
-            <w:r>
-              <w:rPr>
-                <w:rFonts w:ascii="Times New Roman" w:cs="Times New Roman" w:eastAsia="Times New Roman" w:hAnsi="Times New Roman"/>
-                <w:sz w:val="24"/>
-                <w:szCs w:val="24"/>
-              </w:rPr>
-              <w:t xml:space="preserve">___</w:t>
+            <w:shd w:fill="FFFFFF"/>
+          </w:tcPr>
+          <w:p>
+            <w:r>
+              <w:rPr>
+                <w:rFonts w:ascii="Times New Roman" w:hAnsi="Times New Roman" w:eastAsia="Times New Roman"/>
+                <w:b w:val="0"/>
+              </w:rPr>
+              <w:t>202.50</w:t>
             </w:r>
           </w:p>
         </w:tc>
@@ -3258,19 +3291,15 @@
               <w:bottom w:type="dxa" w:w="80"/>
               <w:right w:type="dxa" w:w="100"/>
             </w:tcMar>
-          </w:tcPr>
-          <w:p>
-            <w:pPr>
-              <w:spacing w:after="0" w:line="240" w:lineRule="auto"/>
-              <w:jc w:val="center"/>
-            </w:pPr>
-            <w:r>
-              <w:rPr>
-                <w:rFonts w:ascii="Times New Roman" w:cs="Times New Roman" w:eastAsia="Times New Roman" w:hAnsi="Times New Roman"/>
-                <w:sz w:val="24"/>
-                <w:szCs w:val="24"/>
-              </w:rPr>
-              <w:t xml:space="preserve">___</w:t>
+            <w:shd w:fill="FFFFFF"/>
+          </w:tcPr>
+          <w:p>
+            <w:r>
+              <w:rPr>
+                <w:rFonts w:ascii="Times New Roman" w:hAnsi="Times New Roman" w:eastAsia="Times New Roman"/>
+                <w:b w:val="0"/>
+              </w:rPr>
+              <w:t>218.50</w:t>
             </w:r>
           </w:p>
         </w:tc>
@@ -3289,19 +3318,15 @@
               <w:bottom w:type="dxa" w:w="80"/>
               <w:right w:type="dxa" w:w="100"/>
             </w:tcMar>
-          </w:tcPr>
-          <w:p>
-            <w:pPr>
-              <w:spacing w:after="0" w:line="240" w:lineRule="auto"/>
-              <w:jc w:val="center"/>
-            </w:pPr>
-            <w:r>
-              <w:rPr>
-                <w:rFonts w:ascii="Times New Roman" w:cs="Times New Roman" w:eastAsia="Times New Roman" w:hAnsi="Times New Roman"/>
-                <w:sz w:val="24"/>
-                <w:szCs w:val="24"/>
-              </w:rPr>
-              <w:t xml:space="preserve">___</w:t>
+            <w:shd w:fill="FFFFFF"/>
+          </w:tcPr>
+          <w:p>
+            <w:r>
+              <w:rPr>
+                <w:rFonts w:ascii="Times New Roman" w:hAnsi="Times New Roman" w:eastAsia="Times New Roman"/>
+                <w:b w:val="0"/>
+              </w:rPr>
+              <w:t>0.4713</w:t>
             </w:r>
           </w:p>
         </w:tc>
@@ -3425,12 +3450,12 @@
       <w:tblPr>
         <w:tblW w:type="dxa" w:w="7600"/>
         <w:tblBorders>
-          <w:top w:val="single" w:color="auto" w:sz="4"/>
-          <w:left w:val="single" w:color="auto" w:sz="4"/>
-          <w:bottom w:val="single" w:color="auto" w:sz="4"/>
-          <w:right w:val="single" w:color="auto" w:sz="4"/>
-          <w:insideH w:val="single" w:color="auto" w:sz="4"/>
-          <w:insideV w:val="single" w:color="auto" w:sz="4"/>
+          <w:top w:val="single" w:color="000000" w:sz="6" w:space="0"/>
+          <w:left w:val="single" w:color="000000" w:sz="6" w:space="0"/>
+          <w:bottom w:val="single" w:color="000000" w:sz="6" w:space="0"/>
+          <w:right w:val="single" w:color="000000" w:sz="6" w:space="0"/>
+          <w:insideH w:val="single" w:color="000000" w:sz="6" w:space="0"/>
+          <w:insideV w:val="single" w:color="000000" w:sz="6" w:space="0"/>
         </w:tblBorders>
       </w:tblPr>
       <w:tblGrid>
@@ -3451,28 +3476,21 @@
               <w:bottom w:val="single" w:color="000000" w:sz="4"/>
               <w:right w:val="single" w:color="000000" w:sz="4"/>
             </w:tcBorders>
-            <w:shd w:fill="E7E6E6" w:val="clear"/>
-            <w:tcMar>
-              <w:top w:type="dxa" w:w="80"/>
-              <w:left w:type="dxa" w:w="100"/>
-              <w:bottom w:type="dxa" w:w="80"/>
-              <w:right w:type="dxa" w:w="100"/>
-            </w:tcMar>
-          </w:tcPr>
-          <w:p>
-            <w:pPr>
-              <w:spacing w:after="0" w:line="240" w:lineRule="auto"/>
-              <w:jc w:val="center"/>
-            </w:pPr>
-            <w:r>
-              <w:rPr>
-                <w:rFonts w:ascii="Times New Roman" w:cs="Times New Roman" w:eastAsia="Times New Roman" w:hAnsi="Times New Roman"/>
+            <w:tcMar>
+              <w:top w:type="dxa" w:w="80"/>
+              <w:left w:type="dxa" w:w="100"/>
+              <w:bottom w:type="dxa" w:w="80"/>
+              <w:right w:type="dxa" w:w="100"/>
+            </w:tcMar>
+            <w:shd w:fill="D9EAF7"/>
+          </w:tcPr>
+          <w:p>
+            <w:r>
+              <w:rPr>
+                <w:rFonts w:ascii="Times New Roman" w:hAnsi="Times New Roman" w:eastAsia="Times New Roman"/>
                 <w:b/>
-                <w:bCs/>
-                <w:sz w:val="24"/>
-                <w:szCs w:val="24"/>
-              </w:rPr>
-              <w:t xml:space="preserve">Итерация</w:t>
+              </w:rPr>
+              <w:t>Итерация</w:t>
             </w:r>
           </w:p>
         </w:tc>
@@ -3485,28 +3503,21 @@
               <w:bottom w:val="single" w:color="000000" w:sz="4"/>
               <w:right w:val="single" w:color="000000" w:sz="4"/>
             </w:tcBorders>
-            <w:shd w:fill="E7E6E6" w:val="clear"/>
-            <w:tcMar>
-              <w:top w:type="dxa" w:w="80"/>
-              <w:left w:type="dxa" w:w="100"/>
-              <w:bottom w:type="dxa" w:w="80"/>
-              <w:right w:type="dxa" w:w="100"/>
-            </w:tcMar>
-          </w:tcPr>
-          <w:p>
-            <w:pPr>
-              <w:spacing w:after="0" w:line="240" w:lineRule="auto"/>
-              <w:jc w:val="center"/>
-            </w:pPr>
-            <w:r>
-              <w:rPr>
-                <w:rFonts w:ascii="Times New Roman" w:cs="Times New Roman" w:eastAsia="Times New Roman" w:hAnsi="Times New Roman"/>
+            <w:tcMar>
+              <w:top w:type="dxa" w:w="80"/>
+              <w:left w:type="dxa" w:w="100"/>
+              <w:bottom w:type="dxa" w:w="80"/>
+              <w:right w:type="dxa" w:w="100"/>
+            </w:tcMar>
+            <w:shd w:fill="D9EAF7"/>
+          </w:tcPr>
+          <w:p>
+            <w:r>
+              <w:rPr>
+                <w:rFonts w:ascii="Times New Roman" w:hAnsi="Times New Roman" w:eastAsia="Times New Roman"/>
                 <w:b/>
-                <w:bCs/>
-                <w:sz w:val="24"/>
-                <w:szCs w:val="24"/>
-              </w:rPr>
-              <w:t xml:space="preserve">max |ΔV|</w:t>
+              </w:rPr>
+              <w:t>max |ΔV|</w:t>
             </w:r>
           </w:p>
         </w:tc>
@@ -3519,28 +3530,21 @@
               <w:bottom w:val="single" w:color="000000" w:sz="4"/>
               <w:right w:val="single" w:color="000000" w:sz="4"/>
             </w:tcBorders>
-            <w:shd w:fill="E7E6E6" w:val="clear"/>
-            <w:tcMar>
-              <w:top w:type="dxa" w:w="80"/>
-              <w:left w:type="dxa" w:w="100"/>
-              <w:bottom w:type="dxa" w:w="80"/>
-              <w:right w:type="dxa" w:w="100"/>
-            </w:tcMar>
-          </w:tcPr>
-          <w:p>
-            <w:pPr>
-              <w:spacing w:after="0" w:line="240" w:lineRule="auto"/>
-              <w:jc w:val="center"/>
-            </w:pPr>
-            <w:r>
-              <w:rPr>
-                <w:rFonts w:ascii="Times New Roman" w:cs="Times New Roman" w:eastAsia="Times New Roman" w:hAnsi="Times New Roman"/>
+            <w:tcMar>
+              <w:top w:type="dxa" w:w="80"/>
+              <w:left w:type="dxa" w:w="100"/>
+              <w:bottom w:type="dxa" w:w="80"/>
+              <w:right w:type="dxa" w:w="100"/>
+            </w:tcMar>
+            <w:shd w:fill="D9EAF7"/>
+          </w:tcPr>
+          <w:p>
+            <w:r>
+              <w:rPr>
+                <w:rFonts w:ascii="Times New Roman" w:hAnsi="Times New Roman" w:eastAsia="Times New Roman"/>
                 <w:b/>
-                <w:bCs/>
-                <w:sz w:val="24"/>
-                <w:szCs w:val="24"/>
-              </w:rPr>
-              <w:t xml:space="preserve">Сумма V(s) по всем s</w:t>
+              </w:rPr>
+              <w:t>Сумма V(s) по всем s</w:t>
             </w:r>
           </w:p>
         </w:tc>
@@ -3561,19 +3565,15 @@
               <w:bottom w:type="dxa" w:w="80"/>
               <w:right w:type="dxa" w:w="100"/>
             </w:tcMar>
-          </w:tcPr>
-          <w:p>
-            <w:pPr>
-              <w:spacing w:after="0" w:line="240" w:lineRule="auto"/>
-              <w:jc w:val="center"/>
-            </w:pPr>
-            <w:r>
-              <w:rPr>
-                <w:rFonts w:ascii="Times New Roman" w:cs="Times New Roman" w:eastAsia="Times New Roman" w:hAnsi="Times New Roman"/>
-                <w:sz w:val="24"/>
-                <w:szCs w:val="24"/>
-              </w:rPr>
-              <w:t xml:space="preserve">1</w:t>
+            <w:shd w:fill="FFFFFF"/>
+          </w:tcPr>
+          <w:p>
+            <w:r>
+              <w:rPr>
+                <w:rFonts w:ascii="Times New Roman" w:hAnsi="Times New Roman" w:eastAsia="Times New Roman"/>
+                <w:b w:val="0"/>
+              </w:rPr>
+              <w:t>1</w:t>
             </w:r>
           </w:p>
         </w:tc>
@@ -3592,19 +3592,15 @@
               <w:bottom w:type="dxa" w:w="80"/>
               <w:right w:type="dxa" w:w="100"/>
             </w:tcMar>
-          </w:tcPr>
-          <w:p>
-            <w:pPr>
-              <w:spacing w:after="0" w:line="240" w:lineRule="auto"/>
-              <w:jc w:val="center"/>
-            </w:pPr>
-            <w:r>
-              <w:rPr>
-                <w:rFonts w:ascii="Times New Roman" w:cs="Times New Roman" w:eastAsia="Times New Roman" w:hAnsi="Times New Roman"/>
-                <w:sz w:val="24"/>
-                <w:szCs w:val="24"/>
-              </w:rPr>
-              <w:t xml:space="preserve">___</w:t>
+            <w:shd w:fill="FFFFFF"/>
+          </w:tcPr>
+          <w:p>
+            <w:r>
+              <w:rPr>
+                <w:rFonts w:ascii="Times New Roman" w:hAnsi="Times New Roman" w:eastAsia="Times New Roman"/>
+                <w:b w:val="0"/>
+              </w:rPr>
+              <w:t>0.333333</w:t>
             </w:r>
           </w:p>
         </w:tc>
@@ -3623,19 +3619,15 @@
               <w:bottom w:type="dxa" w:w="80"/>
               <w:right w:type="dxa" w:w="100"/>
             </w:tcMar>
-          </w:tcPr>
-          <w:p>
-            <w:pPr>
-              <w:spacing w:after="0" w:line="240" w:lineRule="auto"/>
-              <w:jc w:val="center"/>
-            </w:pPr>
-            <w:r>
-              <w:rPr>
-                <w:rFonts w:ascii="Times New Roman" w:cs="Times New Roman" w:eastAsia="Times New Roman" w:hAnsi="Times New Roman"/>
-                <w:sz w:val="24"/>
-                <w:szCs w:val="24"/>
-              </w:rPr>
-              <w:t xml:space="preserve">___</w:t>
+            <w:shd w:fill="FFFFFF"/>
+          </w:tcPr>
+          <w:p>
+            <w:r>
+              <w:rPr>
+                <w:rFonts w:ascii="Times New Roman" w:hAnsi="Times New Roman" w:eastAsia="Times New Roman"/>
+                <w:b w:val="0"/>
+              </w:rPr>
+              <w:t>0.000000</w:t>
             </w:r>
           </w:p>
         </w:tc>
@@ -3656,19 +3648,15 @@
               <w:bottom w:type="dxa" w:w="80"/>
               <w:right w:type="dxa" w:w="100"/>
             </w:tcMar>
-          </w:tcPr>
-          <w:p>
-            <w:pPr>
-              <w:spacing w:after="0" w:line="240" w:lineRule="auto"/>
-              <w:jc w:val="center"/>
-            </w:pPr>
-            <w:r>
-              <w:rPr>
-                <w:rFonts w:ascii="Times New Roman" w:cs="Times New Roman" w:eastAsia="Times New Roman" w:hAnsi="Times New Roman"/>
-                <w:sz w:val="24"/>
-                <w:szCs w:val="24"/>
-              </w:rPr>
-              <w:t xml:space="preserve">10</w:t>
+            <w:shd w:fill="FFFFFF"/>
+          </w:tcPr>
+          <w:p>
+            <w:r>
+              <w:rPr>
+                <w:rFonts w:ascii="Times New Roman" w:hAnsi="Times New Roman" w:eastAsia="Times New Roman"/>
+                <w:b w:val="0"/>
+              </w:rPr>
+              <w:t>10</w:t>
             </w:r>
           </w:p>
         </w:tc>
@@ -3687,19 +3675,15 @@
               <w:bottom w:type="dxa" w:w="80"/>
               <w:right w:type="dxa" w:w="100"/>
             </w:tcMar>
-          </w:tcPr>
-          <w:p>
-            <w:pPr>
-              <w:spacing w:after="0" w:line="240" w:lineRule="auto"/>
-              <w:jc w:val="center"/>
-            </w:pPr>
-            <w:r>
-              <w:rPr>
-                <w:rFonts w:ascii="Times New Roman" w:cs="Times New Roman" w:eastAsia="Times New Roman" w:hAnsi="Times New Roman"/>
-                <w:sz w:val="24"/>
-                <w:szCs w:val="24"/>
-              </w:rPr>
-              <w:t xml:space="preserve">___</w:t>
+            <w:shd w:fill="FFFFFF"/>
+          </w:tcPr>
+          <w:p>
+            <w:r>
+              <w:rPr>
+                <w:rFonts w:ascii="Times New Roman" w:hAnsi="Times New Roman" w:eastAsia="Times New Roman"/>
+                <w:b w:val="0"/>
+              </w:rPr>
+              <w:t>0.0235461</w:t>
             </w:r>
           </w:p>
         </w:tc>
@@ -3718,19 +3702,15 @@
               <w:bottom w:type="dxa" w:w="80"/>
               <w:right w:type="dxa" w:w="100"/>
             </w:tcMar>
-          </w:tcPr>
-          <w:p>
-            <w:pPr>
-              <w:spacing w:after="0" w:line="240" w:lineRule="auto"/>
-              <w:jc w:val="center"/>
-            </w:pPr>
-            <w:r>
-              <w:rPr>
-                <w:rFonts w:ascii="Times New Roman" w:cs="Times New Roman" w:eastAsia="Times New Roman" w:hAnsi="Times New Roman"/>
-                <w:sz w:val="24"/>
-                <w:szCs w:val="24"/>
-              </w:rPr>
-              <w:t xml:space="preserve">___</w:t>
+            <w:shd w:fill="FFFFFF"/>
+          </w:tcPr>
+          <w:p>
+            <w:r>
+              <w:rPr>
+                <w:rFonts w:ascii="Times New Roman" w:hAnsi="Times New Roman" w:eastAsia="Times New Roman"/>
+                <w:b w:val="0"/>
+              </w:rPr>
+              <w:t>2.253795</w:t>
             </w:r>
           </w:p>
         </w:tc>
@@ -3751,19 +3731,15 @@
               <w:bottom w:type="dxa" w:w="80"/>
               <w:right w:type="dxa" w:w="100"/>
             </w:tcMar>
-          </w:tcPr>
-          <w:p>
-            <w:pPr>
-              <w:spacing w:after="0" w:line="240" w:lineRule="auto"/>
-              <w:jc w:val="center"/>
-            </w:pPr>
-            <w:r>
-              <w:rPr>
-                <w:rFonts w:ascii="Times New Roman" w:cs="Times New Roman" w:eastAsia="Times New Roman" w:hAnsi="Times New Roman"/>
-                <w:sz w:val="24"/>
-                <w:szCs w:val="24"/>
-              </w:rPr>
-              <w:t xml:space="preserve">50</w:t>
+            <w:shd w:fill="FFFFFF"/>
+          </w:tcPr>
+          <w:p>
+            <w:r>
+              <w:rPr>
+                <w:rFonts w:ascii="Times New Roman" w:hAnsi="Times New Roman" w:eastAsia="Times New Roman"/>
+                <w:b w:val="0"/>
+              </w:rPr>
+              <w:t>50</w:t>
             </w:r>
           </w:p>
         </w:tc>
@@ -3782,19 +3758,15 @@
               <w:bottom w:type="dxa" w:w="80"/>
               <w:right w:type="dxa" w:w="100"/>
             </w:tcMar>
-          </w:tcPr>
-          <w:p>
-            <w:pPr>
-              <w:spacing w:after="0" w:line="240" w:lineRule="auto"/>
-              <w:jc w:val="center"/>
-            </w:pPr>
-            <w:r>
-              <w:rPr>
-                <w:rFonts w:ascii="Times New Roman" w:cs="Times New Roman" w:eastAsia="Times New Roman" w:hAnsi="Times New Roman"/>
-                <w:sz w:val="24"/>
-                <w:szCs w:val="24"/>
-              </w:rPr>
-              <w:t xml:space="preserve">___</w:t>
+            <w:shd w:fill="FFFFFF"/>
+          </w:tcPr>
+          <w:p>
+            <w:r>
+              <w:rPr>
+                <w:rFonts w:ascii="Times New Roman" w:hAnsi="Times New Roman" w:eastAsia="Times New Roman"/>
+                <w:b w:val="0"/>
+              </w:rPr>
+              <w:t>0.00446373</w:t>
             </w:r>
           </w:p>
         </w:tc>
@@ -3813,19 +3785,15 @@
               <w:bottom w:type="dxa" w:w="80"/>
               <w:right w:type="dxa" w:w="100"/>
             </w:tcMar>
-          </w:tcPr>
-          <w:p>
-            <w:pPr>
-              <w:spacing w:after="0" w:line="240" w:lineRule="auto"/>
-              <w:jc w:val="center"/>
-            </w:pPr>
-            <w:r>
-              <w:rPr>
-                <w:rFonts w:ascii="Times New Roman" w:cs="Times New Roman" w:eastAsia="Times New Roman" w:hAnsi="Times New Roman"/>
-                <w:sz w:val="24"/>
-                <w:szCs w:val="24"/>
-              </w:rPr>
-              <w:t xml:space="preserve">___</w:t>
+            <w:shd w:fill="FFFFFF"/>
+          </w:tcPr>
+          <w:p>
+            <w:r>
+              <w:rPr>
+                <w:rFonts w:ascii="Times New Roman" w:hAnsi="Times New Roman" w:eastAsia="Times New Roman"/>
+                <w:b w:val="0"/>
+              </w:rPr>
+              <w:t>5.286134</w:t>
             </w:r>
           </w:p>
         </w:tc>
@@ -3846,19 +3814,15 @@
               <w:bottom w:type="dxa" w:w="80"/>
               <w:right w:type="dxa" w:w="100"/>
             </w:tcMar>
-          </w:tcPr>
-          <w:p>
-            <w:pPr>
-              <w:spacing w:after="0" w:line="240" w:lineRule="auto"/>
-              <w:jc w:val="center"/>
-            </w:pPr>
-            <w:r>
-              <w:rPr>
-                <w:rFonts w:ascii="Times New Roman" w:cs="Times New Roman" w:eastAsia="Times New Roman" w:hAnsi="Times New Roman"/>
-                <w:sz w:val="24"/>
-                <w:szCs w:val="24"/>
-              </w:rPr>
-              <w:t xml:space="preserve">100</w:t>
+            <w:shd w:fill="FFFFFF"/>
+          </w:tcPr>
+          <w:p>
+            <w:r>
+              <w:rPr>
+                <w:rFonts w:ascii="Times New Roman" w:hAnsi="Times New Roman" w:eastAsia="Times New Roman"/>
+                <w:b w:val="0"/>
+              </w:rPr>
+              <w:t>100</w:t>
             </w:r>
           </w:p>
         </w:tc>
@@ -3877,19 +3841,15 @@
               <w:bottom w:type="dxa" w:w="80"/>
               <w:right w:type="dxa" w:w="100"/>
             </w:tcMar>
-          </w:tcPr>
-          <w:p>
-            <w:pPr>
-              <w:spacing w:after="0" w:line="240" w:lineRule="auto"/>
-              <w:jc w:val="center"/>
-            </w:pPr>
-            <w:r>
-              <w:rPr>
-                <w:rFonts w:ascii="Times New Roman" w:cs="Times New Roman" w:eastAsia="Times New Roman" w:hAnsi="Times New Roman"/>
-                <w:sz w:val="24"/>
-                <w:szCs w:val="24"/>
-              </w:rPr>
-              <w:t xml:space="preserve">___</w:t>
+            <w:shd w:fill="FFFFFF"/>
+          </w:tcPr>
+          <w:p>
+            <w:r>
+              <w:rPr>
+                <w:rFonts w:ascii="Times New Roman" w:hAnsi="Times New Roman" w:eastAsia="Times New Roman"/>
+                <w:b w:val="0"/>
+              </w:rPr>
+              <w:t>0.00115279</w:t>
             </w:r>
           </w:p>
         </w:tc>
@@ -3908,19 +3868,15 @@
               <w:bottom w:type="dxa" w:w="80"/>
               <w:right w:type="dxa" w:w="100"/>
             </w:tcMar>
-          </w:tcPr>
-          <w:p>
-            <w:pPr>
-              <w:spacing w:after="0" w:line="240" w:lineRule="auto"/>
-              <w:jc w:val="center"/>
-            </w:pPr>
-            <w:r>
-              <w:rPr>
-                <w:rFonts w:ascii="Times New Roman" w:cs="Times New Roman" w:eastAsia="Times New Roman" w:hAnsi="Times New Roman"/>
-                <w:sz w:val="24"/>
-                <w:szCs w:val="24"/>
-              </w:rPr>
-              <w:t xml:space="preserve">___</w:t>
+            <w:shd w:fill="FFFFFF"/>
+          </w:tcPr>
+          <w:p>
+            <w:r>
+              <w:rPr>
+                <w:rFonts w:ascii="Times New Roman" w:hAnsi="Times New Roman" w:eastAsia="Times New Roman"/>
+                <w:b w:val="0"/>
+              </w:rPr>
+              <w:t>6.140992</w:t>
             </w:r>
           </w:p>
         </w:tc>
@@ -3941,19 +3897,15 @@
               <w:bottom w:type="dxa" w:w="80"/>
               <w:right w:type="dxa" w:w="100"/>
             </w:tcMar>
-          </w:tcPr>
-          <w:p>
-            <w:pPr>
-              <w:spacing w:after="0" w:line="240" w:lineRule="auto"/>
-              <w:jc w:val="center"/>
-            </w:pPr>
-            <w:r>
-              <w:rPr>
-                <w:rFonts w:ascii="Times New Roman" w:cs="Times New Roman" w:eastAsia="Times New Roman" w:hAnsi="Times New Roman"/>
-                <w:sz w:val="24"/>
-                <w:szCs w:val="24"/>
-              </w:rPr>
-              <w:t xml:space="preserve">До сходимости</w:t>
+            <w:shd w:fill="FFFFFF"/>
+          </w:tcPr>
+          <w:p>
+            <w:r>
+              <w:rPr>
+                <w:rFonts w:ascii="Times New Roman" w:hAnsi="Times New Roman" w:eastAsia="Times New Roman"/>
+                <w:b w:val="0"/>
+              </w:rPr>
+              <w:t>До сходимости</w:t>
             </w:r>
           </w:p>
         </w:tc>
@@ -3972,19 +3924,15 @@
               <w:bottom w:type="dxa" w:w="80"/>
               <w:right w:type="dxa" w:w="100"/>
             </w:tcMar>
-          </w:tcPr>
-          <w:p>
-            <w:pPr>
-              <w:spacing w:after="0" w:line="240" w:lineRule="auto"/>
-              <w:jc w:val="center"/>
-            </w:pPr>
-            <w:r>
-              <w:rPr>
-                <w:rFonts w:ascii="Times New Roman" w:cs="Times New Roman" w:eastAsia="Times New Roman" w:hAnsi="Times New Roman"/>
-                <w:sz w:val="24"/>
-                <w:szCs w:val="24"/>
-              </w:rPr>
-              <w:t xml:space="preserve">___</w:t>
+            <w:shd w:fill="FFFFFF"/>
+          </w:tcPr>
+          <w:p>
+            <w:r>
+              <w:rPr>
+                <w:rFonts w:ascii="Times New Roman" w:hAnsi="Times New Roman" w:eastAsia="Times New Roman"/>
+                <w:b w:val="0"/>
+              </w:rPr>
+              <w:t>9.77144e-09</w:t>
             </w:r>
           </w:p>
         </w:tc>
@@ -4003,19 +3951,15 @@
               <w:bottom w:type="dxa" w:w="80"/>
               <w:right w:type="dxa" w:w="100"/>
             </w:tcMar>
-          </w:tcPr>
-          <w:p>
-            <w:pPr>
-              <w:spacing w:after="0" w:line="240" w:lineRule="auto"/>
-              <w:jc w:val="center"/>
-            </w:pPr>
-            <w:r>
-              <w:rPr>
-                <w:rFonts w:ascii="Times New Roman" w:cs="Times New Roman" w:eastAsia="Times New Roman" w:hAnsi="Times New Roman"/>
-                <w:sz w:val="24"/>
-                <w:szCs w:val="24"/>
-              </w:rPr>
-              <w:t xml:space="preserve">___</w:t>
+            <w:shd w:fill="FFFFFF"/>
+          </w:tcPr>
+          <w:p>
+            <w:r>
+              <w:rPr>
+                <w:rFonts w:ascii="Times New Roman" w:hAnsi="Times New Roman" w:eastAsia="Times New Roman"/>
+                <w:b w:val="0"/>
+              </w:rPr>
+              <w:t>6.339818</w:t>
             </w:r>
           </w:p>
         </w:tc>
@@ -4067,12 +4011,12 @@
       <w:tblPr>
         <w:tblW w:type="dxa" w:w="8000"/>
         <w:tblBorders>
-          <w:top w:val="single" w:color="auto" w:sz="4"/>
-          <w:left w:val="single" w:color="auto" w:sz="4"/>
-          <w:bottom w:val="single" w:color="auto" w:sz="4"/>
-          <w:right w:val="single" w:color="auto" w:sz="4"/>
-          <w:insideH w:val="single" w:color="auto" w:sz="4"/>
-          <w:insideV w:val="single" w:color="auto" w:sz="4"/>
+          <w:top w:val="single" w:color="000000" w:sz="6" w:space="0"/>
+          <w:left w:val="single" w:color="000000" w:sz="6" w:space="0"/>
+          <w:bottom w:val="single" w:color="000000" w:sz="6" w:space="0"/>
+          <w:right w:val="single" w:color="000000" w:sz="6" w:space="0"/>
+          <w:insideH w:val="single" w:color="000000" w:sz="6" w:space="0"/>
+          <w:insideV w:val="single" w:color="000000" w:sz="6" w:space="0"/>
         </w:tblBorders>
       </w:tblPr>
       <w:tblGrid>
@@ -4092,28 +4036,21 @@
               <w:bottom w:val="single" w:color="000000" w:sz="4"/>
               <w:right w:val="single" w:color="000000" w:sz="4"/>
             </w:tcBorders>
-            <w:shd w:fill="E7E6E6" w:val="clear"/>
-            <w:tcMar>
-              <w:top w:type="dxa" w:w="80"/>
-              <w:left w:type="dxa" w:w="100"/>
-              <w:bottom w:type="dxa" w:w="80"/>
-              <w:right w:type="dxa" w:w="100"/>
-            </w:tcMar>
-          </w:tcPr>
-          <w:p>
-            <w:pPr>
-              <w:spacing w:after="0" w:line="240" w:lineRule="auto"/>
-              <w:jc w:val="center"/>
-            </w:pPr>
-            <w:r>
-              <w:rPr>
-                <w:rFonts w:ascii="Times New Roman" w:cs="Times New Roman" w:eastAsia="Times New Roman" w:hAnsi="Times New Roman"/>
+            <w:tcMar>
+              <w:top w:type="dxa" w:w="80"/>
+              <w:left w:type="dxa" w:w="100"/>
+              <w:bottom w:type="dxa" w:w="80"/>
+              <w:right w:type="dxa" w:w="100"/>
+            </w:tcMar>
+            <w:shd w:fill="D9EAF7"/>
+          </w:tcPr>
+          <w:p>
+            <w:r>
+              <w:rPr>
+                <w:rFonts w:ascii="Times New Roman" w:hAnsi="Times New Roman" w:eastAsia="Times New Roman"/>
                 <w:b/>
-                <w:bCs/>
-                <w:sz w:val="24"/>
-                <w:szCs w:val="24"/>
-              </w:rPr>
-              <w:t xml:space="preserve">Параметр</w:t>
+              </w:rPr>
+              <w:t>Параметр</w:t>
             </w:r>
           </w:p>
         </w:tc>
@@ -4126,28 +4063,21 @@
               <w:bottom w:val="single" w:color="000000" w:sz="4"/>
               <w:right w:val="single" w:color="000000" w:sz="4"/>
             </w:tcBorders>
-            <w:shd w:fill="E7E6E6" w:val="clear"/>
-            <w:tcMar>
-              <w:top w:type="dxa" w:w="80"/>
-              <w:left w:type="dxa" w:w="100"/>
-              <w:bottom w:type="dxa" w:w="80"/>
-              <w:right w:type="dxa" w:w="100"/>
-            </w:tcMar>
-          </w:tcPr>
-          <w:p>
-            <w:pPr>
-              <w:spacing w:after="0" w:line="240" w:lineRule="auto"/>
-              <w:jc w:val="center"/>
-            </w:pPr>
-            <w:r>
-              <w:rPr>
-                <w:rFonts w:ascii="Times New Roman" w:cs="Times New Roman" w:eastAsia="Times New Roman" w:hAnsi="Times New Roman"/>
+            <w:tcMar>
+              <w:top w:type="dxa" w:w="80"/>
+              <w:left w:type="dxa" w:w="100"/>
+              <w:bottom w:type="dxa" w:w="80"/>
+              <w:right w:type="dxa" w:w="100"/>
+            </w:tcMar>
+            <w:shd w:fill="D9EAF7"/>
+          </w:tcPr>
+          <w:p>
+            <w:r>
+              <w:rPr>
+                <w:rFonts w:ascii="Times New Roman" w:hAnsi="Times New Roman" w:eastAsia="Times New Roman"/>
                 <w:b/>
-                <w:bCs/>
-                <w:sz w:val="24"/>
-                <w:szCs w:val="24"/>
-              </w:rPr>
-              <w:t xml:space="preserve">Значение</w:t>
+              </w:rPr>
+              <w:t>Значение</w:t>
             </w:r>
           </w:p>
         </w:tc>
@@ -4168,19 +4098,15 @@
               <w:bottom w:type="dxa" w:w="80"/>
               <w:right w:type="dxa" w:w="100"/>
             </w:tcMar>
-          </w:tcPr>
-          <w:p>
-            <w:pPr>
-              <w:spacing w:after="0" w:line="240" w:lineRule="auto"/>
-              <w:jc w:val="center"/>
-            </w:pPr>
-            <w:r>
-              <w:rPr>
-                <w:rFonts w:ascii="Times New Roman" w:cs="Times New Roman" w:eastAsia="Times New Roman" w:hAnsi="Times New Roman"/>
-                <w:sz w:val="24"/>
-                <w:szCs w:val="24"/>
-              </w:rPr>
-              <w:t xml:space="preserve">Число итераций до сходимости</w:t>
+            <w:shd w:fill="FFFFFF"/>
+          </w:tcPr>
+          <w:p>
+            <w:r>
+              <w:rPr>
+                <w:rFonts w:ascii="Times New Roman" w:hAnsi="Times New Roman" w:eastAsia="Times New Roman"/>
+                <w:b w:val="0"/>
+              </w:rPr>
+              <w:t>Число итераций до сходимости</w:t>
             </w:r>
           </w:p>
         </w:tc>
@@ -4199,19 +4125,15 @@
               <w:bottom w:type="dxa" w:w="80"/>
               <w:right w:type="dxa" w:w="100"/>
             </w:tcMar>
-          </w:tcPr>
-          <w:p>
-            <w:pPr>
-              <w:spacing w:after="0" w:line="240" w:lineRule="auto"/>
-              <w:jc w:val="center"/>
-            </w:pPr>
-            <w:r>
-              <w:rPr>
-                <w:rFonts w:ascii="Times New Roman" w:cs="Times New Roman" w:eastAsia="Times New Roman" w:hAnsi="Times New Roman"/>
-                <w:sz w:val="24"/>
-                <w:szCs w:val="24"/>
-              </w:rPr>
-              <w:t xml:space="preserve">___</w:t>
+            <w:shd w:fill="FFFFFF"/>
+          </w:tcPr>
+          <w:p>
+            <w:r>
+              <w:rPr>
+                <w:rFonts w:ascii="Times New Roman" w:hAnsi="Times New Roman" w:eastAsia="Times New Roman"/>
+                <w:b w:val="0"/>
+              </w:rPr>
+              <w:t>438</w:t>
             </w:r>
           </w:p>
         </w:tc>
@@ -4232,19 +4154,15 @@
               <w:bottom w:type="dxa" w:w="80"/>
               <w:right w:type="dxa" w:w="100"/>
             </w:tcMar>
-          </w:tcPr>
-          <w:p>
-            <w:pPr>
-              <w:spacing w:after="0" w:line="240" w:lineRule="auto"/>
-              <w:jc w:val="center"/>
-            </w:pPr>
-            <w:r>
-              <w:rPr>
-                <w:rFonts w:ascii="Times New Roman" w:cs="Times New Roman" w:eastAsia="Times New Roman" w:hAnsi="Times New Roman"/>
-                <w:sz w:val="24"/>
-                <w:szCs w:val="24"/>
-              </w:rPr>
-              <w:t xml:space="preserve">Время вычисления, с</w:t>
+            <w:shd w:fill="FFFFFF"/>
+          </w:tcPr>
+          <w:p>
+            <w:r>
+              <w:rPr>
+                <w:rFonts w:ascii="Times New Roman" w:hAnsi="Times New Roman" w:eastAsia="Times New Roman"/>
+                <w:b w:val="0"/>
+              </w:rPr>
+              <w:t>Время вычисления, с</w:t>
             </w:r>
           </w:p>
         </w:tc>
@@ -4263,19 +4181,15 @@
               <w:bottom w:type="dxa" w:w="80"/>
               <w:right w:type="dxa" w:w="100"/>
             </w:tcMar>
-          </w:tcPr>
-          <w:p>
-            <w:pPr>
-              <w:spacing w:after="0" w:line="240" w:lineRule="auto"/>
-              <w:jc w:val="center"/>
-            </w:pPr>
-            <w:r>
-              <w:rPr>
-                <w:rFonts w:ascii="Times New Roman" w:cs="Times New Roman" w:eastAsia="Times New Roman" w:hAnsi="Times New Roman"/>
-                <w:sz w:val="24"/>
-                <w:szCs w:val="24"/>
-              </w:rPr>
-              <w:t xml:space="preserve">___</w:t>
+            <w:shd w:fill="FFFFFF"/>
+          </w:tcPr>
+          <w:p>
+            <w:r>
+              <w:rPr>
+                <w:rFonts w:ascii="Times New Roman" w:hAnsi="Times New Roman" w:eastAsia="Times New Roman"/>
+                <w:b w:val="0"/>
+              </w:rPr>
+              <w:t>0.0716</w:t>
             </w:r>
           </w:p>
         </w:tc>
@@ -4296,19 +4210,15 @@
               <w:bottom w:type="dxa" w:w="80"/>
               <w:right w:type="dxa" w:w="100"/>
             </w:tcMar>
-          </w:tcPr>
-          <w:p>
-            <w:pPr>
-              <w:spacing w:after="0" w:line="240" w:lineRule="auto"/>
-              <w:jc w:val="center"/>
-            </w:pPr>
-            <w:r>
-              <w:rPr>
-                <w:rFonts w:ascii="Times New Roman" w:cs="Times New Roman" w:eastAsia="Times New Roman" w:hAnsi="Times New Roman"/>
-                <w:sz w:val="24"/>
-                <w:szCs w:val="24"/>
-              </w:rPr>
-              <w:t xml:space="preserve">Доля успешных эпизодов</w:t>
+            <w:shd w:fill="FFFFFF"/>
+          </w:tcPr>
+          <w:p>
+            <w:r>
+              <w:rPr>
+                <w:rFonts w:ascii="Times New Roman" w:hAnsi="Times New Roman" w:eastAsia="Times New Roman"/>
+                <w:b w:val="0"/>
+              </w:rPr>
+              <w:t>Доля успешных эпизодов</w:t>
             </w:r>
           </w:p>
         </w:tc>
@@ -4327,19 +4237,15 @@
               <w:bottom w:type="dxa" w:w="80"/>
               <w:right w:type="dxa" w:w="100"/>
             </w:tcMar>
-          </w:tcPr>
-          <w:p>
-            <w:pPr>
-              <w:spacing w:after="0" w:line="240" w:lineRule="auto"/>
-              <w:jc w:val="center"/>
-            </w:pPr>
-            <w:r>
-              <w:rPr>
-                <w:rFonts w:ascii="Times New Roman" w:cs="Times New Roman" w:eastAsia="Times New Roman" w:hAnsi="Times New Roman"/>
-                <w:sz w:val="24"/>
-                <w:szCs w:val="24"/>
-              </w:rPr>
-              <w:t xml:space="preserve">___ %</w:t>
+            <w:shd w:fill="FFFFFF"/>
+          </w:tcPr>
+          <w:p>
+            <w:r>
+              <w:rPr>
+                <w:rFonts w:ascii="Times New Roman" w:hAnsi="Times New Roman" w:eastAsia="Times New Roman"/>
+                <w:b w:val="0"/>
+              </w:rPr>
+              <w:t>75.2 %</w:t>
             </w:r>
           </w:p>
         </w:tc>
@@ -4360,19 +4266,15 @@
               <w:bottom w:type="dxa" w:w="80"/>
               <w:right w:type="dxa" w:w="100"/>
             </w:tcMar>
-          </w:tcPr>
-          <w:p>
-            <w:pPr>
-              <w:spacing w:after="0" w:line="240" w:lineRule="auto"/>
-              <w:jc w:val="center"/>
-            </w:pPr>
-            <w:r>
-              <w:rPr>
-                <w:rFonts w:ascii="Times New Roman" w:cs="Times New Roman" w:eastAsia="Times New Roman" w:hAnsi="Times New Roman"/>
-                <w:sz w:val="24"/>
-                <w:szCs w:val="24"/>
-              </w:rPr>
-              <w:t xml:space="preserve">Средняя награда за эпизод</w:t>
+            <w:shd w:fill="FFFFFF"/>
+          </w:tcPr>
+          <w:p>
+            <w:r>
+              <w:rPr>
+                <w:rFonts w:ascii="Times New Roman" w:hAnsi="Times New Roman" w:eastAsia="Times New Roman"/>
+                <w:b w:val="0"/>
+              </w:rPr>
+              <w:t>Средняя награда за эпизод</w:t>
             </w:r>
           </w:p>
         </w:tc>
@@ -4391,19 +4293,15 @@
               <w:bottom w:type="dxa" w:w="80"/>
               <w:right w:type="dxa" w:w="100"/>
             </w:tcMar>
-          </w:tcPr>
-          <w:p>
-            <w:pPr>
-              <w:spacing w:after="0" w:line="240" w:lineRule="auto"/>
-              <w:jc w:val="center"/>
-            </w:pPr>
-            <w:r>
-              <w:rPr>
-                <w:rFonts w:ascii="Times New Roman" w:cs="Times New Roman" w:eastAsia="Times New Roman" w:hAnsi="Times New Roman"/>
-                <w:sz w:val="24"/>
-                <w:szCs w:val="24"/>
-              </w:rPr>
-              <w:t xml:space="preserve">___</w:t>
+            <w:shd w:fill="FFFFFF"/>
+          </w:tcPr>
+          <w:p>
+            <w:r>
+              <w:rPr>
+                <w:rFonts w:ascii="Times New Roman" w:hAnsi="Times New Roman" w:eastAsia="Times New Roman"/>
+                <w:b w:val="0"/>
+              </w:rPr>
+              <w:t>0.752</w:t>
             </w:r>
           </w:p>
         </w:tc>
@@ -4527,12 +4425,12 @@
       <w:tblPr>
         <w:tblW w:type="dxa" w:w="9000"/>
         <w:tblBorders>
-          <w:top w:val="single" w:color="auto" w:sz="4"/>
-          <w:left w:val="single" w:color="auto" w:sz="4"/>
-          <w:bottom w:val="single" w:color="auto" w:sz="4"/>
-          <w:right w:val="single" w:color="auto" w:sz="4"/>
-          <w:insideH w:val="single" w:color="auto" w:sz="4"/>
-          <w:insideV w:val="single" w:color="auto" w:sz="4"/>
+          <w:top w:val="single" w:color="000000" w:sz="6" w:space="0"/>
+          <w:left w:val="single" w:color="000000" w:sz="6" w:space="0"/>
+          <w:bottom w:val="single" w:color="000000" w:sz="6" w:space="0"/>
+          <w:right w:val="single" w:color="000000" w:sz="6" w:space="0"/>
+          <w:insideH w:val="single" w:color="000000" w:sz="6" w:space="0"/>
+          <w:insideV w:val="single" w:color="000000" w:sz="6" w:space="0"/>
         </w:tblBorders>
       </w:tblPr>
       <w:tblGrid>
@@ -4553,28 +4451,21 @@
               <w:bottom w:val="single" w:color="000000" w:sz="4"/>
               <w:right w:val="single" w:color="000000" w:sz="4"/>
             </w:tcBorders>
-            <w:shd w:fill="E7E6E6" w:val="clear"/>
-            <w:tcMar>
-              <w:top w:type="dxa" w:w="80"/>
-              <w:left w:type="dxa" w:w="100"/>
-              <w:bottom w:type="dxa" w:w="80"/>
-              <w:right w:type="dxa" w:w="100"/>
-            </w:tcMar>
-          </w:tcPr>
-          <w:p>
-            <w:pPr>
-              <w:spacing w:after="0" w:line="240" w:lineRule="auto"/>
-              <w:jc w:val="center"/>
-            </w:pPr>
-            <w:r>
-              <w:rPr>
-                <w:rFonts w:ascii="Times New Roman" w:cs="Times New Roman" w:eastAsia="Times New Roman" w:hAnsi="Times New Roman"/>
+            <w:tcMar>
+              <w:top w:type="dxa" w:w="80"/>
+              <w:left w:type="dxa" w:w="100"/>
+              <w:bottom w:type="dxa" w:w="80"/>
+              <w:right w:type="dxa" w:w="100"/>
+            </w:tcMar>
+            <w:shd w:fill="D9EAF7"/>
+          </w:tcPr>
+          <w:p>
+            <w:r>
+              <w:rPr>
+                <w:rFonts w:ascii="Times New Roman" w:hAnsi="Times New Roman" w:eastAsia="Times New Roman"/>
                 <w:b/>
-                <w:bCs/>
-                <w:sz w:val="24"/>
-                <w:szCs w:val="24"/>
-              </w:rPr>
-              <w:t xml:space="preserve">Метрика</w:t>
+              </w:rPr>
+              <w:t>Метрика</w:t>
             </w:r>
           </w:p>
         </w:tc>
@@ -4587,28 +4478,21 @@
               <w:bottom w:val="single" w:color="000000" w:sz="4"/>
               <w:right w:val="single" w:color="000000" w:sz="4"/>
             </w:tcBorders>
-            <w:shd w:fill="E7E6E6" w:val="clear"/>
-            <w:tcMar>
-              <w:top w:type="dxa" w:w="80"/>
-              <w:left w:type="dxa" w:w="100"/>
-              <w:bottom w:type="dxa" w:w="80"/>
-              <w:right w:type="dxa" w:w="100"/>
-            </w:tcMar>
-          </w:tcPr>
-          <w:p>
-            <w:pPr>
-              <w:spacing w:after="0" w:line="240" w:lineRule="auto"/>
-              <w:jc w:val="center"/>
-            </w:pPr>
-            <w:r>
-              <w:rPr>
-                <w:rFonts w:ascii="Times New Roman" w:cs="Times New Roman" w:eastAsia="Times New Roman" w:hAnsi="Times New Roman"/>
+            <w:tcMar>
+              <w:top w:type="dxa" w:w="80"/>
+              <w:left w:type="dxa" w:w="100"/>
+              <w:bottom w:type="dxa" w:w="80"/>
+              <w:right w:type="dxa" w:w="100"/>
+            </w:tcMar>
+            <w:shd w:fill="D9EAF7"/>
+          </w:tcPr>
+          <w:p>
+            <w:r>
+              <w:rPr>
+                <w:rFonts w:ascii="Times New Roman" w:hAnsi="Times New Roman" w:eastAsia="Times New Roman"/>
                 <w:b/>
-                <w:bCs/>
-                <w:sz w:val="24"/>
-                <w:szCs w:val="24"/>
-              </w:rPr>
-              <w:t xml:space="preserve">Value Iteration</w:t>
+              </w:rPr>
+              <w:t>Value Iteration</w:t>
             </w:r>
           </w:p>
         </w:tc>
@@ -4621,28 +4505,21 @@
               <w:bottom w:val="single" w:color="000000" w:sz="4"/>
               <w:right w:val="single" w:color="000000" w:sz="4"/>
             </w:tcBorders>
-            <w:shd w:fill="E7E6E6" w:val="clear"/>
-            <w:tcMar>
-              <w:top w:type="dxa" w:w="80"/>
-              <w:left w:type="dxa" w:w="100"/>
-              <w:bottom w:type="dxa" w:w="80"/>
-              <w:right w:type="dxa" w:w="100"/>
-            </w:tcMar>
-          </w:tcPr>
-          <w:p>
-            <w:pPr>
-              <w:spacing w:after="0" w:line="240" w:lineRule="auto"/>
-              <w:jc w:val="center"/>
-            </w:pPr>
-            <w:r>
-              <w:rPr>
-                <w:rFonts w:ascii="Times New Roman" w:cs="Times New Roman" w:eastAsia="Times New Roman" w:hAnsi="Times New Roman"/>
+            <w:tcMar>
+              <w:top w:type="dxa" w:w="80"/>
+              <w:left w:type="dxa" w:w="100"/>
+              <w:bottom w:type="dxa" w:w="80"/>
+              <w:right w:type="dxa" w:w="100"/>
+            </w:tcMar>
+            <w:shd w:fill="D9EAF7"/>
+          </w:tcPr>
+          <w:p>
+            <w:r>
+              <w:rPr>
+                <w:rFonts w:ascii="Times New Roman" w:hAnsi="Times New Roman" w:eastAsia="Times New Roman"/>
                 <w:b/>
-                <w:bCs/>
-                <w:sz w:val="24"/>
-                <w:szCs w:val="24"/>
-              </w:rPr>
-              <w:t xml:space="preserve">Q-learning</w:t>
+              </w:rPr>
+              <w:t>Q-learning</w:t>
             </w:r>
           </w:p>
         </w:tc>
@@ -4663,19 +4540,15 @@
               <w:bottom w:type="dxa" w:w="80"/>
               <w:right w:type="dxa" w:w="100"/>
             </w:tcMar>
-          </w:tcPr>
-          <w:p>
-            <w:pPr>
-              <w:spacing w:after="0" w:line="240" w:lineRule="auto"/>
-              <w:jc w:val="center"/>
-            </w:pPr>
-            <w:r>
-              <w:rPr>
-                <w:rFonts w:ascii="Times New Roman" w:cs="Times New Roman" w:eastAsia="Times New Roman" w:hAnsi="Times New Roman"/>
-                <w:sz w:val="24"/>
-                <w:szCs w:val="24"/>
-              </w:rPr>
-              <w:t xml:space="preserve">Знание модели среды</w:t>
+            <w:shd w:fill="FFFFFF"/>
+          </w:tcPr>
+          <w:p>
+            <w:r>
+              <w:rPr>
+                <w:rFonts w:ascii="Times New Roman" w:hAnsi="Times New Roman" w:eastAsia="Times New Roman"/>
+                <w:b w:val="0"/>
+              </w:rPr>
+              <w:t>Знание модели среды</w:t>
             </w:r>
           </w:p>
         </w:tc>
@@ -4694,19 +4567,15 @@
               <w:bottom w:type="dxa" w:w="80"/>
               <w:right w:type="dxa" w:w="100"/>
             </w:tcMar>
-          </w:tcPr>
-          <w:p>
-            <w:pPr>
-              <w:spacing w:after="0" w:line="240" w:lineRule="auto"/>
-              <w:jc w:val="center"/>
-            </w:pPr>
-            <w:r>
-              <w:rPr>
-                <w:rFonts w:ascii="Times New Roman" w:cs="Times New Roman" w:eastAsia="Times New Roman" w:hAnsi="Times New Roman"/>
-                <w:sz w:val="24"/>
-                <w:szCs w:val="24"/>
-              </w:rPr>
-              <w:t xml:space="preserve">требуется</w:t>
+            <w:shd w:fill="FFFFFF"/>
+          </w:tcPr>
+          <w:p>
+            <w:r>
+              <w:rPr>
+                <w:rFonts w:ascii="Times New Roman" w:hAnsi="Times New Roman" w:eastAsia="Times New Roman"/>
+                <w:b w:val="0"/>
+              </w:rPr>
+              <w:t>требуется</w:t>
             </w:r>
           </w:p>
         </w:tc>
@@ -4725,19 +4594,15 @@
               <w:bottom w:type="dxa" w:w="80"/>
               <w:right w:type="dxa" w:w="100"/>
             </w:tcMar>
-          </w:tcPr>
-          <w:p>
-            <w:pPr>
-              <w:spacing w:after="0" w:line="240" w:lineRule="auto"/>
-              <w:jc w:val="center"/>
-            </w:pPr>
-            <w:r>
-              <w:rPr>
-                <w:rFonts w:ascii="Times New Roman" w:cs="Times New Roman" w:eastAsia="Times New Roman" w:hAnsi="Times New Roman"/>
-                <w:sz w:val="24"/>
-                <w:szCs w:val="24"/>
-              </w:rPr>
-              <w:t xml:space="preserve">не требуется</w:t>
+            <w:shd w:fill="FFFFFF"/>
+          </w:tcPr>
+          <w:p>
+            <w:r>
+              <w:rPr>
+                <w:rFonts w:ascii="Times New Roman" w:hAnsi="Times New Roman" w:eastAsia="Times New Roman"/>
+                <w:b w:val="0"/>
+              </w:rPr>
+              <w:t>не требуется</w:t>
             </w:r>
           </w:p>
         </w:tc>
@@ -4758,19 +4623,15 @@
               <w:bottom w:type="dxa" w:w="80"/>
               <w:right w:type="dxa" w:w="100"/>
             </w:tcMar>
-          </w:tcPr>
-          <w:p>
-            <w:pPr>
-              <w:spacing w:after="0" w:line="240" w:lineRule="auto"/>
-              <w:jc w:val="center"/>
-            </w:pPr>
-            <w:r>
-              <w:rPr>
-                <w:rFonts w:ascii="Times New Roman" w:cs="Times New Roman" w:eastAsia="Times New Roman" w:hAnsi="Times New Roman"/>
-                <w:sz w:val="24"/>
-                <w:szCs w:val="24"/>
-              </w:rPr>
-              <w:t xml:space="preserve">Образцов взаимодействия</w:t>
+            <w:shd w:fill="FFFFFF"/>
+          </w:tcPr>
+          <w:p>
+            <w:r>
+              <w:rPr>
+                <w:rFonts w:ascii="Times New Roman" w:hAnsi="Times New Roman" w:eastAsia="Times New Roman"/>
+                <w:b w:val="0"/>
+              </w:rPr>
+              <w:t>Образцов взаимодействия</w:t>
             </w:r>
           </w:p>
         </w:tc>
@@ -4789,19 +4650,15 @@
               <w:bottom w:type="dxa" w:w="80"/>
               <w:right w:type="dxa" w:w="100"/>
             </w:tcMar>
-          </w:tcPr>
-          <w:p>
-            <w:pPr>
-              <w:spacing w:after="0" w:line="240" w:lineRule="auto"/>
-              <w:jc w:val="center"/>
-            </w:pPr>
-            <w:r>
-              <w:rPr>
-                <w:rFonts w:ascii="Times New Roman" w:cs="Times New Roman" w:eastAsia="Times New Roman" w:hAnsi="Times New Roman"/>
-                <w:sz w:val="24"/>
-                <w:szCs w:val="24"/>
-              </w:rPr>
-              <w:t xml:space="preserve">0</w:t>
+            <w:shd w:fill="FFFFFF"/>
+          </w:tcPr>
+          <w:p>
+            <w:r>
+              <w:rPr>
+                <w:rFonts w:ascii="Times New Roman" w:hAnsi="Times New Roman" w:eastAsia="Times New Roman"/>
+                <w:b w:val="0"/>
+              </w:rPr>
+              <w:t>0</w:t>
             </w:r>
           </w:p>
         </w:tc>
@@ -4820,19 +4677,15 @@
               <w:bottom w:type="dxa" w:w="80"/>
               <w:right w:type="dxa" w:w="100"/>
             </w:tcMar>
-          </w:tcPr>
-          <w:p>
-            <w:pPr>
-              <w:spacing w:after="0" w:line="240" w:lineRule="auto"/>
-              <w:jc w:val="center"/>
-            </w:pPr>
-            <w:r>
-              <w:rPr>
-                <w:rFonts w:ascii="Times New Roman" w:cs="Times New Roman" w:eastAsia="Times New Roman" w:hAnsi="Times New Roman"/>
-                <w:sz w:val="24"/>
-                <w:szCs w:val="24"/>
-              </w:rPr>
-              <w:t xml:space="preserve">___</w:t>
+            <w:shd w:fill="FFFFFF"/>
+          </w:tcPr>
+          <w:p>
+            <w:r>
+              <w:rPr>
+                <w:rFonts w:ascii="Times New Roman" w:hAnsi="Times New Roman" w:eastAsia="Times New Roman"/>
+                <w:b w:val="0"/>
+              </w:rPr>
+              <w:t>639245</w:t>
             </w:r>
           </w:p>
         </w:tc>
@@ -4853,19 +4706,15 @@
               <w:bottom w:type="dxa" w:w="80"/>
               <w:right w:type="dxa" w:w="100"/>
             </w:tcMar>
-          </w:tcPr>
-          <w:p>
-            <w:pPr>
-              <w:spacing w:after="0" w:line="240" w:lineRule="auto"/>
-              <w:jc w:val="center"/>
-            </w:pPr>
-            <w:r>
-              <w:rPr>
-                <w:rFonts w:ascii="Times New Roman" w:cs="Times New Roman" w:eastAsia="Times New Roman" w:hAnsi="Times New Roman"/>
-                <w:sz w:val="24"/>
-                <w:szCs w:val="24"/>
-              </w:rPr>
-              <w:t xml:space="preserve">Время обучения, с</w:t>
+            <w:shd w:fill="FFFFFF"/>
+          </w:tcPr>
+          <w:p>
+            <w:r>
+              <w:rPr>
+                <w:rFonts w:ascii="Times New Roman" w:hAnsi="Times New Roman" w:eastAsia="Times New Roman"/>
+                <w:b w:val="0"/>
+              </w:rPr>
+              <w:t>Время обучения, с</w:t>
             </w:r>
           </w:p>
         </w:tc>
@@ -4884,19 +4733,15 @@
               <w:bottom w:type="dxa" w:w="80"/>
               <w:right w:type="dxa" w:w="100"/>
             </w:tcMar>
-          </w:tcPr>
-          <w:p>
-            <w:pPr>
-              <w:spacing w:after="0" w:line="240" w:lineRule="auto"/>
-              <w:jc w:val="center"/>
-            </w:pPr>
-            <w:r>
-              <w:rPr>
-                <w:rFonts w:ascii="Times New Roman" w:cs="Times New Roman" w:eastAsia="Times New Roman" w:hAnsi="Times New Roman"/>
-                <w:sz w:val="24"/>
-                <w:szCs w:val="24"/>
-              </w:rPr>
-              <w:t xml:space="preserve">___</w:t>
+            <w:shd w:fill="FFFFFF"/>
+          </w:tcPr>
+          <w:p>
+            <w:r>
+              <w:rPr>
+                <w:rFonts w:ascii="Times New Roman" w:hAnsi="Times New Roman" w:eastAsia="Times New Roman"/>
+                <w:b w:val="0"/>
+              </w:rPr>
+              <w:t>0.0716</w:t>
             </w:r>
           </w:p>
         </w:tc>
@@ -4915,19 +4760,15 @@
               <w:bottom w:type="dxa" w:w="80"/>
               <w:right w:type="dxa" w:w="100"/>
             </w:tcMar>
-          </w:tcPr>
-          <w:p>
-            <w:pPr>
-              <w:spacing w:after="0" w:line="240" w:lineRule="auto"/>
-              <w:jc w:val="center"/>
-            </w:pPr>
-            <w:r>
-              <w:rPr>
-                <w:rFonts w:ascii="Times New Roman" w:cs="Times New Roman" w:eastAsia="Times New Roman" w:hAnsi="Times New Roman"/>
-                <w:sz w:val="24"/>
-                <w:szCs w:val="24"/>
-              </w:rPr>
-              <w:t xml:space="preserve">___</w:t>
+            <w:shd w:fill="FFFFFF"/>
+          </w:tcPr>
+          <w:p>
+            <w:r>
+              <w:rPr>
+                <w:rFonts w:ascii="Times New Roman" w:hAnsi="Times New Roman" w:eastAsia="Times New Roman"/>
+                <w:b w:val="0"/>
+              </w:rPr>
+              <w:t>10.3906</w:t>
             </w:r>
           </w:p>
         </w:tc>
@@ -4948,19 +4789,15 @@
               <w:bottom w:type="dxa" w:w="80"/>
               <w:right w:type="dxa" w:w="100"/>
             </w:tcMar>
-          </w:tcPr>
-          <w:p>
-            <w:pPr>
-              <w:spacing w:after="0" w:line="240" w:lineRule="auto"/>
-              <w:jc w:val="center"/>
-            </w:pPr>
-            <w:r>
-              <w:rPr>
-                <w:rFonts w:ascii="Times New Roman" w:cs="Times New Roman" w:eastAsia="Times New Roman" w:hAnsi="Times New Roman"/>
-                <w:sz w:val="24"/>
-                <w:szCs w:val="24"/>
-              </w:rPr>
-              <w:t xml:space="preserve">Доля успешных эпизодов (тест)</w:t>
+            <w:shd w:fill="FFFFFF"/>
+          </w:tcPr>
+          <w:p>
+            <w:r>
+              <w:rPr>
+                <w:rFonts w:ascii="Times New Roman" w:hAnsi="Times New Roman" w:eastAsia="Times New Roman"/>
+                <w:b w:val="0"/>
+              </w:rPr>
+              <w:t>Доля успешных эпизодов (тест)</w:t>
             </w:r>
           </w:p>
         </w:tc>
@@ -4979,19 +4816,15 @@
               <w:bottom w:type="dxa" w:w="80"/>
               <w:right w:type="dxa" w:w="100"/>
             </w:tcMar>
-          </w:tcPr>
-          <w:p>
-            <w:pPr>
-              <w:spacing w:after="0" w:line="240" w:lineRule="auto"/>
-              <w:jc w:val="center"/>
-            </w:pPr>
-            <w:r>
-              <w:rPr>
-                <w:rFonts w:ascii="Times New Roman" w:cs="Times New Roman" w:eastAsia="Times New Roman" w:hAnsi="Times New Roman"/>
-                <w:sz w:val="24"/>
-                <w:szCs w:val="24"/>
-              </w:rPr>
-              <w:t xml:space="preserve">___ %</w:t>
+            <w:shd w:fill="FFFFFF"/>
+          </w:tcPr>
+          <w:p>
+            <w:r>
+              <w:rPr>
+                <w:rFonts w:ascii="Times New Roman" w:hAnsi="Times New Roman" w:eastAsia="Times New Roman"/>
+                <w:b w:val="0"/>
+              </w:rPr>
+              <w:t>75.2 %</w:t>
             </w:r>
           </w:p>
         </w:tc>
@@ -5010,19 +4843,15 @@
               <w:bottom w:type="dxa" w:w="80"/>
               <w:right w:type="dxa" w:w="100"/>
             </w:tcMar>
-          </w:tcPr>
-          <w:p>
-            <w:pPr>
-              <w:spacing w:after="0" w:line="240" w:lineRule="auto"/>
-              <w:jc w:val="center"/>
-            </w:pPr>
-            <w:r>
-              <w:rPr>
-                <w:rFonts w:ascii="Times New Roman" w:cs="Times New Roman" w:eastAsia="Times New Roman" w:hAnsi="Times New Roman"/>
-                <w:sz w:val="24"/>
-                <w:szCs w:val="24"/>
-              </w:rPr>
-              <w:t xml:space="preserve">___ %</w:t>
+            <w:shd w:fill="FFFFFF"/>
+          </w:tcPr>
+          <w:p>
+            <w:r>
+              <w:rPr>
+                <w:rFonts w:ascii="Times New Roman" w:hAnsi="Times New Roman" w:eastAsia="Times New Roman"/>
+                <w:b w:val="0"/>
+              </w:rPr>
+              <w:t>55.3 %</w:t>
             </w:r>
           </w:p>
         </w:tc>
@@ -5043,19 +4872,15 @@
               <w:bottom w:type="dxa" w:w="80"/>
               <w:right w:type="dxa" w:w="100"/>
             </w:tcMar>
-          </w:tcPr>
-          <w:p>
-            <w:pPr>
-              <w:spacing w:after="0" w:line="240" w:lineRule="auto"/>
-              <w:jc w:val="center"/>
-            </w:pPr>
-            <w:r>
-              <w:rPr>
-                <w:rFonts w:ascii="Times New Roman" w:cs="Times New Roman" w:eastAsia="Times New Roman" w:hAnsi="Times New Roman"/>
-                <w:sz w:val="24"/>
-                <w:szCs w:val="24"/>
-              </w:rPr>
-              <w:t xml:space="preserve">Совпадение с оптимальной политикой</w:t>
+            <w:shd w:fill="FFFFFF"/>
+          </w:tcPr>
+          <w:p>
+            <w:r>
+              <w:rPr>
+                <w:rFonts w:ascii="Times New Roman" w:hAnsi="Times New Roman" w:eastAsia="Times New Roman"/>
+                <w:b w:val="0"/>
+              </w:rPr>
+              <w:t>Совпадение с оптимальной политикой</w:t>
             </w:r>
           </w:p>
         </w:tc>
@@ -5074,19 +4899,15 @@
               <w:bottom w:type="dxa" w:w="80"/>
               <w:right w:type="dxa" w:w="100"/>
             </w:tcMar>
-          </w:tcPr>
-          <w:p>
-            <w:pPr>
-              <w:spacing w:after="0" w:line="240" w:lineRule="auto"/>
-              <w:jc w:val="center"/>
-            </w:pPr>
-            <w:r>
-              <w:rPr>
-                <w:rFonts w:ascii="Times New Roman" w:cs="Times New Roman" w:eastAsia="Times New Roman" w:hAnsi="Times New Roman"/>
-                <w:sz w:val="24"/>
-                <w:szCs w:val="24"/>
-              </w:rPr>
-              <w:t xml:space="preserve">100 %</w:t>
+            <w:shd w:fill="FFFFFF"/>
+          </w:tcPr>
+          <w:p>
+            <w:r>
+              <w:rPr>
+                <w:rFonts w:ascii="Times New Roman" w:hAnsi="Times New Roman" w:eastAsia="Times New Roman"/>
+                <w:b w:val="0"/>
+              </w:rPr>
+              <w:t>100 %</w:t>
             </w:r>
           </w:p>
         </w:tc>
@@ -5105,19 +4926,15 @@
               <w:bottom w:type="dxa" w:w="80"/>
               <w:right w:type="dxa" w:w="100"/>
             </w:tcMar>
-          </w:tcPr>
-          <w:p>
-            <w:pPr>
-              <w:spacing w:after="0" w:line="240" w:lineRule="auto"/>
-              <w:jc w:val="center"/>
-            </w:pPr>
-            <w:r>
-              <w:rPr>
-                <w:rFonts w:ascii="Times New Roman" w:cs="Times New Roman" w:eastAsia="Times New Roman" w:hAnsi="Times New Roman"/>
-                <w:sz w:val="24"/>
-                <w:szCs w:val="24"/>
-              </w:rPr>
-              <w:t xml:space="preserve">___ %</w:t>
+            <w:shd w:fill="FFFFFF"/>
+          </w:tcPr>
+          <w:p>
+            <w:r>
+              <w:rPr>
+                <w:rFonts w:ascii="Times New Roman" w:hAnsi="Times New Roman" w:eastAsia="Times New Roman"/>
+                <w:b w:val="0"/>
+              </w:rPr>
+              <w:t>93.8 %</w:t>
             </w:r>
           </w:p>
         </w:tc>
@@ -5241,12 +5058,12 @@
       <w:tblPr>
         <w:tblW w:type="dxa" w:w="9000"/>
         <w:tblBorders>
-          <w:top w:val="single" w:color="auto" w:sz="4"/>
-          <w:left w:val="single" w:color="auto" w:sz="4"/>
-          <w:bottom w:val="single" w:color="auto" w:sz="4"/>
-          <w:right w:val="single" w:color="auto" w:sz="4"/>
-          <w:insideH w:val="single" w:color="auto" w:sz="4"/>
-          <w:insideV w:val="single" w:color="auto" w:sz="4"/>
+          <w:top w:val="single" w:color="000000" w:sz="6" w:space="0"/>
+          <w:left w:val="single" w:color="000000" w:sz="6" w:space="0"/>
+          <w:bottom w:val="single" w:color="000000" w:sz="6" w:space="0"/>
+          <w:right w:val="single" w:color="000000" w:sz="6" w:space="0"/>
+          <w:insideH w:val="single" w:color="000000" w:sz="6" w:space="0"/>
+          <w:insideV w:val="single" w:color="000000" w:sz="6" w:space="0"/>
         </w:tblBorders>
       </w:tblPr>
       <w:tblGrid>
@@ -5268,28 +5085,21 @@
               <w:bottom w:val="single" w:color="000000" w:sz="4"/>
               <w:right w:val="single" w:color="000000" w:sz="4"/>
             </w:tcBorders>
-            <w:shd w:fill="E7E6E6" w:val="clear"/>
-            <w:tcMar>
-              <w:top w:type="dxa" w:w="80"/>
-              <w:left w:type="dxa" w:w="100"/>
-              <w:bottom w:type="dxa" w:w="80"/>
-              <w:right w:type="dxa" w:w="100"/>
-            </w:tcMar>
-          </w:tcPr>
-          <w:p>
-            <w:pPr>
-              <w:spacing w:after="0" w:line="240" w:lineRule="auto"/>
-              <w:jc w:val="center"/>
-            </w:pPr>
-            <w:r>
-              <w:rPr>
-                <w:rFonts w:ascii="Times New Roman" w:cs="Times New Roman" w:eastAsia="Times New Roman" w:hAnsi="Times New Roman"/>
+            <w:tcMar>
+              <w:top w:type="dxa" w:w="80"/>
+              <w:left w:type="dxa" w:w="100"/>
+              <w:bottom w:type="dxa" w:w="80"/>
+              <w:right w:type="dxa" w:w="100"/>
+            </w:tcMar>
+            <w:shd w:fill="D9EAF7"/>
+          </w:tcPr>
+          <w:p>
+            <w:r>
+              <w:rPr>
+                <w:rFonts w:ascii="Times New Roman" w:hAnsi="Times New Roman" w:eastAsia="Times New Roman"/>
                 <w:b/>
-                <w:bCs/>
-                <w:sz w:val="24"/>
-                <w:szCs w:val="24"/>
-              </w:rPr>
-              <w:t xml:space="preserve">Эпизод</w:t>
+              </w:rPr>
+              <w:t>Эпизод</w:t>
             </w:r>
           </w:p>
         </w:tc>
@@ -5302,28 +5112,21 @@
               <w:bottom w:val="single" w:color="000000" w:sz="4"/>
               <w:right w:val="single" w:color="000000" w:sz="4"/>
             </w:tcBorders>
-            <w:shd w:fill="E7E6E6" w:val="clear"/>
-            <w:tcMar>
-              <w:top w:type="dxa" w:w="80"/>
-              <w:left w:type="dxa" w:w="100"/>
-              <w:bottom w:type="dxa" w:w="80"/>
-              <w:right w:type="dxa" w:w="100"/>
-            </w:tcMar>
-          </w:tcPr>
-          <w:p>
-            <w:pPr>
-              <w:spacing w:after="0" w:line="240" w:lineRule="auto"/>
-              <w:jc w:val="center"/>
-            </w:pPr>
-            <w:r>
-              <w:rPr>
-                <w:rFonts w:ascii="Times New Roman" w:cs="Times New Roman" w:eastAsia="Times New Roman" w:hAnsi="Times New Roman"/>
+            <w:tcMar>
+              <w:top w:type="dxa" w:w="80"/>
+              <w:left w:type="dxa" w:w="100"/>
+              <w:bottom w:type="dxa" w:w="80"/>
+              <w:right w:type="dxa" w:w="100"/>
+            </w:tcMar>
+            <w:shd w:fill="D9EAF7"/>
+          </w:tcPr>
+          <w:p>
+            <w:r>
+              <w:rPr>
+                <w:rFonts w:ascii="Times New Roman" w:hAnsi="Times New Roman" w:eastAsia="Times New Roman"/>
                 <w:b/>
-                <w:bCs/>
-                <w:sz w:val="24"/>
-                <w:szCs w:val="24"/>
-              </w:rPr>
-              <w:t xml:space="preserve">Средняя награда (100 посл.)</w:t>
+              </w:rPr>
+              <w:t>Средняя награда (100 посл.)</w:t>
             </w:r>
           </w:p>
         </w:tc>
@@ -5336,28 +5139,21 @@
               <w:bottom w:val="single" w:color="000000" w:sz="4"/>
               <w:right w:val="single" w:color="000000" w:sz="4"/>
             </w:tcBorders>
-            <w:shd w:fill="E7E6E6" w:val="clear"/>
-            <w:tcMar>
-              <w:top w:type="dxa" w:w="80"/>
-              <w:left w:type="dxa" w:w="100"/>
-              <w:bottom w:type="dxa" w:w="80"/>
-              <w:right w:type="dxa" w:w="100"/>
-            </w:tcMar>
-          </w:tcPr>
-          <w:p>
-            <w:pPr>
-              <w:spacing w:after="0" w:line="240" w:lineRule="auto"/>
-              <w:jc w:val="center"/>
-            </w:pPr>
-            <w:r>
-              <w:rPr>
-                <w:rFonts w:ascii="Times New Roman" w:cs="Times New Roman" w:eastAsia="Times New Roman" w:hAnsi="Times New Roman"/>
+            <w:tcMar>
+              <w:top w:type="dxa" w:w="80"/>
+              <w:left w:type="dxa" w:w="100"/>
+              <w:bottom w:type="dxa" w:w="80"/>
+              <w:right w:type="dxa" w:w="100"/>
+            </w:tcMar>
+            <w:shd w:fill="D9EAF7"/>
+          </w:tcPr>
+          <w:p>
+            <w:r>
+              <w:rPr>
+                <w:rFonts w:ascii="Times New Roman" w:hAnsi="Times New Roman" w:eastAsia="Times New Roman"/>
                 <w:b/>
-                <w:bCs/>
-                <w:sz w:val="24"/>
-                <w:szCs w:val="24"/>
-              </w:rPr>
-              <w:t xml:space="preserve">ε</w:t>
+              </w:rPr>
+              <w:t>ε</w:t>
             </w:r>
           </w:p>
         </w:tc>
@@ -5370,28 +5166,21 @@
               <w:bottom w:val="single" w:color="000000" w:sz="4"/>
               <w:right w:val="single" w:color="000000" w:sz="4"/>
             </w:tcBorders>
-            <w:shd w:fill="E7E6E6" w:val="clear"/>
-            <w:tcMar>
-              <w:top w:type="dxa" w:w="80"/>
-              <w:left w:type="dxa" w:w="100"/>
-              <w:bottom w:type="dxa" w:w="80"/>
-              <w:right w:type="dxa" w:w="100"/>
-            </w:tcMar>
-          </w:tcPr>
-          <w:p>
-            <w:pPr>
-              <w:spacing w:after="0" w:line="240" w:lineRule="auto"/>
-              <w:jc w:val="center"/>
-            </w:pPr>
-            <w:r>
-              <w:rPr>
-                <w:rFonts w:ascii="Times New Roman" w:cs="Times New Roman" w:eastAsia="Times New Roman" w:hAnsi="Times New Roman"/>
+            <w:tcMar>
+              <w:top w:type="dxa" w:w="80"/>
+              <w:left w:type="dxa" w:w="100"/>
+              <w:bottom w:type="dxa" w:w="80"/>
+              <w:right w:type="dxa" w:w="100"/>
+            </w:tcMar>
+            <w:shd w:fill="D9EAF7"/>
+          </w:tcPr>
+          <w:p>
+            <w:r>
+              <w:rPr>
+                <w:rFonts w:ascii="Times New Roman" w:hAnsi="Times New Roman" w:eastAsia="Times New Roman"/>
                 <w:b/>
-                <w:bCs/>
-                <w:sz w:val="24"/>
-                <w:szCs w:val="24"/>
-              </w:rPr>
-              <w:t xml:space="preserve">Размер буфера</w:t>
+              </w:rPr>
+              <w:t>Размер буфера</w:t>
             </w:r>
           </w:p>
         </w:tc>
@@ -5412,19 +5201,15 @@
               <w:bottom w:type="dxa" w:w="80"/>
               <w:right w:type="dxa" w:w="100"/>
             </w:tcMar>
-          </w:tcPr>
-          <w:p>
-            <w:pPr>
-              <w:spacing w:after="0" w:line="240" w:lineRule="auto"/>
-              <w:jc w:val="center"/>
-            </w:pPr>
-            <w:r>
-              <w:rPr>
-                <w:rFonts w:ascii="Times New Roman" w:cs="Times New Roman" w:eastAsia="Times New Roman" w:hAnsi="Times New Roman"/>
-                <w:sz w:val="24"/>
-                <w:szCs w:val="24"/>
-              </w:rPr>
-              <w:t xml:space="preserve">100</w:t>
+            <w:shd w:fill="FFFFFF"/>
+          </w:tcPr>
+          <w:p>
+            <w:r>
+              <w:rPr>
+                <w:rFonts w:ascii="Times New Roman" w:hAnsi="Times New Roman" w:eastAsia="Times New Roman"/>
+                <w:b w:val="0"/>
+              </w:rPr>
+              <w:t>100</w:t>
             </w:r>
           </w:p>
         </w:tc>
@@ -5443,19 +5228,15 @@
               <w:bottom w:type="dxa" w:w="80"/>
               <w:right w:type="dxa" w:w="100"/>
             </w:tcMar>
-          </w:tcPr>
-          <w:p>
-            <w:pPr>
-              <w:spacing w:after="0" w:line="240" w:lineRule="auto"/>
-              <w:jc w:val="center"/>
-            </w:pPr>
-            <w:r>
-              <w:rPr>
-                <w:rFonts w:ascii="Times New Roman" w:cs="Times New Roman" w:eastAsia="Times New Roman" w:hAnsi="Times New Roman"/>
-                <w:sz w:val="24"/>
-                <w:szCs w:val="24"/>
-              </w:rPr>
-              <w:t xml:space="preserve">___</w:t>
+            <w:shd w:fill="FFFFFF"/>
+          </w:tcPr>
+          <w:p>
+            <w:r>
+              <w:rPr>
+                <w:rFonts w:ascii="Times New Roman" w:hAnsi="Times New Roman" w:eastAsia="Times New Roman"/>
+                <w:b w:val="0"/>
+              </w:rPr>
+              <w:t>25.00</w:t>
             </w:r>
           </w:p>
         </w:tc>
@@ -5474,19 +5255,15 @@
               <w:bottom w:type="dxa" w:w="80"/>
               <w:right w:type="dxa" w:w="100"/>
             </w:tcMar>
-          </w:tcPr>
-          <w:p>
-            <w:pPr>
-              <w:spacing w:after="0" w:line="240" w:lineRule="auto"/>
-              <w:jc w:val="center"/>
-            </w:pPr>
-            <w:r>
-              <w:rPr>
-                <w:rFonts w:ascii="Times New Roman" w:cs="Times New Roman" w:eastAsia="Times New Roman" w:hAnsi="Times New Roman"/>
-                <w:sz w:val="24"/>
-                <w:szCs w:val="24"/>
-              </w:rPr>
-              <w:t xml:space="preserve">___</w:t>
+            <w:shd w:fill="FFFFFF"/>
+          </w:tcPr>
+          <w:p>
+            <w:r>
+              <w:rPr>
+                <w:rFonts w:ascii="Times New Roman" w:hAnsi="Times New Roman" w:eastAsia="Times New Roman"/>
+                <w:b w:val="0"/>
+              </w:rPr>
+              <w:t>0.755</w:t>
             </w:r>
           </w:p>
         </w:tc>
@@ -5505,19 +5282,15 @@
               <w:bottom w:type="dxa" w:w="80"/>
               <w:right w:type="dxa" w:w="100"/>
             </w:tcMar>
-          </w:tcPr>
-          <w:p>
-            <w:pPr>
-              <w:spacing w:after="0" w:line="240" w:lineRule="auto"/>
-              <w:jc w:val="center"/>
-            </w:pPr>
-            <w:r>
-              <w:rPr>
-                <w:rFonts w:ascii="Times New Roman" w:cs="Times New Roman" w:eastAsia="Times New Roman" w:hAnsi="Times New Roman"/>
-                <w:sz w:val="24"/>
-                <w:szCs w:val="24"/>
-              </w:rPr>
-              <w:t xml:space="preserve">___</w:t>
+            <w:shd w:fill="FFFFFF"/>
+          </w:tcPr>
+          <w:p>
+            <w:r>
+              <w:rPr>
+                <w:rFonts w:ascii="Times New Roman" w:hAnsi="Times New Roman" w:eastAsia="Times New Roman"/>
+                <w:b w:val="0"/>
+              </w:rPr>
+              <w:t>2500</w:t>
             </w:r>
           </w:p>
         </w:tc>
@@ -5538,19 +5311,15 @@
               <w:bottom w:type="dxa" w:w="80"/>
               <w:right w:type="dxa" w:w="100"/>
             </w:tcMar>
-          </w:tcPr>
-          <w:p>
-            <w:pPr>
-              <w:spacing w:after="0" w:line="240" w:lineRule="auto"/>
-              <w:jc w:val="center"/>
-            </w:pPr>
-            <w:r>
-              <w:rPr>
-                <w:rFonts w:ascii="Times New Roman" w:cs="Times New Roman" w:eastAsia="Times New Roman" w:hAnsi="Times New Roman"/>
-                <w:sz w:val="24"/>
-                <w:szCs w:val="24"/>
-              </w:rPr>
-              <w:t xml:space="preserve">300</w:t>
+            <w:shd w:fill="FFFFFF"/>
+          </w:tcPr>
+          <w:p>
+            <w:r>
+              <w:rPr>
+                <w:rFonts w:ascii="Times New Roman" w:hAnsi="Times New Roman" w:eastAsia="Times New Roman"/>
+                <w:b w:val="0"/>
+              </w:rPr>
+              <w:t>Финал</w:t>
             </w:r>
           </w:p>
         </w:tc>
@@ -5569,19 +5338,15 @@
               <w:bottom w:type="dxa" w:w="80"/>
               <w:right w:type="dxa" w:w="100"/>
             </w:tcMar>
-          </w:tcPr>
-          <w:p>
-            <w:pPr>
-              <w:spacing w:after="0" w:line="240" w:lineRule="auto"/>
-              <w:jc w:val="center"/>
-            </w:pPr>
-            <w:r>
-              <w:rPr>
-                <w:rFonts w:ascii="Times New Roman" w:cs="Times New Roman" w:eastAsia="Times New Roman" w:hAnsi="Times New Roman"/>
-                <w:sz w:val="24"/>
-                <w:szCs w:val="24"/>
-              </w:rPr>
-              <w:t xml:space="preserve">___</w:t>
+            <w:shd w:fill="FFFFFF"/>
+          </w:tcPr>
+          <w:p>
+            <w:r>
+              <w:rPr>
+                <w:rFonts w:ascii="Times New Roman" w:hAnsi="Times New Roman" w:eastAsia="Times New Roman"/>
+                <w:b w:val="0"/>
+              </w:rPr>
+              <w:t>197.10</w:t>
             </w:r>
           </w:p>
         </w:tc>
@@ -5600,19 +5365,15 @@
               <w:bottom w:type="dxa" w:w="80"/>
               <w:right w:type="dxa" w:w="100"/>
             </w:tcMar>
-          </w:tcPr>
-          <w:p>
-            <w:pPr>
-              <w:spacing w:after="0" w:line="240" w:lineRule="auto"/>
-              <w:jc w:val="center"/>
-            </w:pPr>
-            <w:r>
-              <w:rPr>
-                <w:rFonts w:ascii="Times New Roman" w:cs="Times New Roman" w:eastAsia="Times New Roman" w:hAnsi="Times New Roman"/>
-                <w:sz w:val="24"/>
-                <w:szCs w:val="24"/>
-              </w:rPr>
-              <w:t xml:space="preserve">___</w:t>
+            <w:shd w:fill="FFFFFF"/>
+          </w:tcPr>
+          <w:p>
+            <w:r>
+              <w:rPr>
+                <w:rFonts w:ascii="Times New Roman" w:hAnsi="Times New Roman" w:eastAsia="Times New Roman"/>
+                <w:b w:val="0"/>
+              </w:rPr>
+              <w:t>0.020</w:t>
             </w:r>
           </w:p>
         </w:tc>
@@ -5631,397 +5392,15 @@
               <w:bottom w:type="dxa" w:w="80"/>
               <w:right w:type="dxa" w:w="100"/>
             </w:tcMar>
-          </w:tcPr>
-          <w:p>
-            <w:pPr>
-              <w:spacing w:after="0" w:line="240" w:lineRule="auto"/>
-              <w:jc w:val="center"/>
-            </w:pPr>
-            <w:r>
-              <w:rPr>
-                <w:rFonts w:ascii="Times New Roman" w:cs="Times New Roman" w:eastAsia="Times New Roman" w:hAnsi="Times New Roman"/>
-                <w:sz w:val="24"/>
-                <w:szCs w:val="24"/>
-              </w:rPr>
-              <w:t xml:space="preserve">___</w:t>
-            </w:r>
-          </w:p>
-        </w:tc>
-      </w:tr>
-      <w:tr>
-        <w:tc>
-          <w:tcPr>
-            <w:tcW w:type="dxa" w:w="1500"/>
-            <w:tcBorders>
-              <w:top w:val="single" w:color="000000" w:sz="4"/>
-              <w:left w:val="single" w:color="000000" w:sz="4"/>
-              <w:bottom w:val="single" w:color="000000" w:sz="4"/>
-              <w:right w:val="single" w:color="000000" w:sz="4"/>
-            </w:tcBorders>
-            <w:tcMar>
-              <w:top w:type="dxa" w:w="80"/>
-              <w:left w:type="dxa" w:w="100"/>
-              <w:bottom w:type="dxa" w:w="80"/>
-              <w:right w:type="dxa" w:w="100"/>
-            </w:tcMar>
-          </w:tcPr>
-          <w:p>
-            <w:pPr>
-              <w:spacing w:after="0" w:line="240" w:lineRule="auto"/>
-              <w:jc w:val="center"/>
-            </w:pPr>
-            <w:r>
-              <w:rPr>
-                <w:rFonts w:ascii="Times New Roman" w:cs="Times New Roman" w:eastAsia="Times New Roman" w:hAnsi="Times New Roman"/>
-                <w:sz w:val="24"/>
-                <w:szCs w:val="24"/>
-              </w:rPr>
-              <w:t xml:space="preserve">500</w:t>
-            </w:r>
-          </w:p>
-        </w:tc>
-        <w:tc>
-          <w:tcPr>
-            <w:tcW w:type="dxa" w:w="3500"/>
-            <w:tcBorders>
-              <w:top w:val="single" w:color="000000" w:sz="4"/>
-              <w:left w:val="single" w:color="000000" w:sz="4"/>
-              <w:bottom w:val="single" w:color="000000" w:sz="4"/>
-              <w:right w:val="single" w:color="000000" w:sz="4"/>
-            </w:tcBorders>
-            <w:tcMar>
-              <w:top w:type="dxa" w:w="80"/>
-              <w:left w:type="dxa" w:w="100"/>
-              <w:bottom w:type="dxa" w:w="80"/>
-              <w:right w:type="dxa" w:w="100"/>
-            </w:tcMar>
-          </w:tcPr>
-          <w:p>
-            <w:pPr>
-              <w:spacing w:after="0" w:line="240" w:lineRule="auto"/>
-              <w:jc w:val="center"/>
-            </w:pPr>
-            <w:r>
-              <w:rPr>
-                <w:rFonts w:ascii="Times New Roman" w:cs="Times New Roman" w:eastAsia="Times New Roman" w:hAnsi="Times New Roman"/>
-                <w:sz w:val="24"/>
-                <w:szCs w:val="24"/>
-              </w:rPr>
-              <w:t xml:space="preserve">___</w:t>
-            </w:r>
-          </w:p>
-        </w:tc>
-        <w:tc>
-          <w:tcPr>
-            <w:tcW w:type="dxa" w:w="1500"/>
-            <w:tcBorders>
-              <w:top w:val="single" w:color="000000" w:sz="4"/>
-              <w:left w:val="single" w:color="000000" w:sz="4"/>
-              <w:bottom w:val="single" w:color="000000" w:sz="4"/>
-              <w:right w:val="single" w:color="000000" w:sz="4"/>
-            </w:tcBorders>
-            <w:tcMar>
-              <w:top w:type="dxa" w:w="80"/>
-              <w:left w:type="dxa" w:w="100"/>
-              <w:bottom w:type="dxa" w:w="80"/>
-              <w:right w:type="dxa" w:w="100"/>
-            </w:tcMar>
-          </w:tcPr>
-          <w:p>
-            <w:pPr>
-              <w:spacing w:after="0" w:line="240" w:lineRule="auto"/>
-              <w:jc w:val="center"/>
-            </w:pPr>
-            <w:r>
-              <w:rPr>
-                <w:rFonts w:ascii="Times New Roman" w:cs="Times New Roman" w:eastAsia="Times New Roman" w:hAnsi="Times New Roman"/>
-                <w:sz w:val="24"/>
-                <w:szCs w:val="24"/>
-              </w:rPr>
-              <w:t xml:space="preserve">___</w:t>
-            </w:r>
-          </w:p>
-        </w:tc>
-        <w:tc>
-          <w:tcPr>
-            <w:tcW w:type="dxa" w:w="2500"/>
-            <w:tcBorders>
-              <w:top w:val="single" w:color="000000" w:sz="4"/>
-              <w:left w:val="single" w:color="000000" w:sz="4"/>
-              <w:bottom w:val="single" w:color="000000" w:sz="4"/>
-              <w:right w:val="single" w:color="000000" w:sz="4"/>
-            </w:tcBorders>
-            <w:tcMar>
-              <w:top w:type="dxa" w:w="80"/>
-              <w:left w:type="dxa" w:w="100"/>
-              <w:bottom w:type="dxa" w:w="80"/>
-              <w:right w:type="dxa" w:w="100"/>
-            </w:tcMar>
-          </w:tcPr>
-          <w:p>
-            <w:pPr>
-              <w:spacing w:after="0" w:line="240" w:lineRule="auto"/>
-              <w:jc w:val="center"/>
-            </w:pPr>
-            <w:r>
-              <w:rPr>
-                <w:rFonts w:ascii="Times New Roman" w:cs="Times New Roman" w:eastAsia="Times New Roman" w:hAnsi="Times New Roman"/>
-                <w:sz w:val="24"/>
-                <w:szCs w:val="24"/>
-              </w:rPr>
-              <w:t xml:space="preserve">___</w:t>
-            </w:r>
-          </w:p>
-        </w:tc>
-      </w:tr>
-      <w:tr>
-        <w:tc>
-          <w:tcPr>
-            <w:tcW w:type="dxa" w:w="1500"/>
-            <w:tcBorders>
-              <w:top w:val="single" w:color="000000" w:sz="4"/>
-              <w:left w:val="single" w:color="000000" w:sz="4"/>
-              <w:bottom w:val="single" w:color="000000" w:sz="4"/>
-              <w:right w:val="single" w:color="000000" w:sz="4"/>
-            </w:tcBorders>
-            <w:tcMar>
-              <w:top w:type="dxa" w:w="80"/>
-              <w:left w:type="dxa" w:w="100"/>
-              <w:bottom w:type="dxa" w:w="80"/>
-              <w:right w:type="dxa" w:w="100"/>
-            </w:tcMar>
-          </w:tcPr>
-          <w:p>
-            <w:pPr>
-              <w:spacing w:after="0" w:line="240" w:lineRule="auto"/>
-              <w:jc w:val="center"/>
-            </w:pPr>
-            <w:r>
-              <w:rPr>
-                <w:rFonts w:ascii="Times New Roman" w:cs="Times New Roman" w:eastAsia="Times New Roman" w:hAnsi="Times New Roman"/>
-                <w:sz w:val="24"/>
-                <w:szCs w:val="24"/>
-              </w:rPr>
-              <w:t xml:space="preserve">700</w:t>
-            </w:r>
-          </w:p>
-        </w:tc>
-        <w:tc>
-          <w:tcPr>
-            <w:tcW w:type="dxa" w:w="3500"/>
-            <w:tcBorders>
-              <w:top w:val="single" w:color="000000" w:sz="4"/>
-              <w:left w:val="single" w:color="000000" w:sz="4"/>
-              <w:bottom w:val="single" w:color="000000" w:sz="4"/>
-              <w:right w:val="single" w:color="000000" w:sz="4"/>
-            </w:tcBorders>
-            <w:tcMar>
-              <w:top w:type="dxa" w:w="80"/>
-              <w:left w:type="dxa" w:w="100"/>
-              <w:bottom w:type="dxa" w:w="80"/>
-              <w:right w:type="dxa" w:w="100"/>
-            </w:tcMar>
-          </w:tcPr>
-          <w:p>
-            <w:pPr>
-              <w:spacing w:after="0" w:line="240" w:lineRule="auto"/>
-              <w:jc w:val="center"/>
-            </w:pPr>
-            <w:r>
-              <w:rPr>
-                <w:rFonts w:ascii="Times New Roman" w:cs="Times New Roman" w:eastAsia="Times New Roman" w:hAnsi="Times New Roman"/>
-                <w:sz w:val="24"/>
-                <w:szCs w:val="24"/>
-              </w:rPr>
-              <w:t xml:space="preserve">___</w:t>
-            </w:r>
-          </w:p>
-        </w:tc>
-        <w:tc>
-          <w:tcPr>
-            <w:tcW w:type="dxa" w:w="1500"/>
-            <w:tcBorders>
-              <w:top w:val="single" w:color="000000" w:sz="4"/>
-              <w:left w:val="single" w:color="000000" w:sz="4"/>
-              <w:bottom w:val="single" w:color="000000" w:sz="4"/>
-              <w:right w:val="single" w:color="000000" w:sz="4"/>
-            </w:tcBorders>
-            <w:tcMar>
-              <w:top w:type="dxa" w:w="80"/>
-              <w:left w:type="dxa" w:w="100"/>
-              <w:bottom w:type="dxa" w:w="80"/>
-              <w:right w:type="dxa" w:w="100"/>
-            </w:tcMar>
-          </w:tcPr>
-          <w:p>
-            <w:pPr>
-              <w:spacing w:after="0" w:line="240" w:lineRule="auto"/>
-              <w:jc w:val="center"/>
-            </w:pPr>
-            <w:r>
-              <w:rPr>
-                <w:rFonts w:ascii="Times New Roman" w:cs="Times New Roman" w:eastAsia="Times New Roman" w:hAnsi="Times New Roman"/>
-                <w:sz w:val="24"/>
-                <w:szCs w:val="24"/>
-              </w:rPr>
-              <w:t xml:space="preserve">___</w:t>
-            </w:r>
-          </w:p>
-        </w:tc>
-        <w:tc>
-          <w:tcPr>
-            <w:tcW w:type="dxa" w:w="2500"/>
-            <w:tcBorders>
-              <w:top w:val="single" w:color="000000" w:sz="4"/>
-              <w:left w:val="single" w:color="000000" w:sz="4"/>
-              <w:bottom w:val="single" w:color="000000" w:sz="4"/>
-              <w:right w:val="single" w:color="000000" w:sz="4"/>
-            </w:tcBorders>
-            <w:tcMar>
-              <w:top w:type="dxa" w:w="80"/>
-              <w:left w:type="dxa" w:w="100"/>
-              <w:bottom w:type="dxa" w:w="80"/>
-              <w:right w:type="dxa" w:w="100"/>
-            </w:tcMar>
-          </w:tcPr>
-          <w:p>
-            <w:pPr>
-              <w:spacing w:after="0" w:line="240" w:lineRule="auto"/>
-              <w:jc w:val="center"/>
-            </w:pPr>
-            <w:r>
-              <w:rPr>
-                <w:rFonts w:ascii="Times New Roman" w:cs="Times New Roman" w:eastAsia="Times New Roman" w:hAnsi="Times New Roman"/>
-                <w:sz w:val="24"/>
-                <w:szCs w:val="24"/>
-              </w:rPr>
-              <w:t xml:space="preserve">___</w:t>
-            </w:r>
-          </w:p>
-        </w:tc>
-      </w:tr>
-      <w:tr>
-        <w:tc>
-          <w:tcPr>
-            <w:tcW w:type="dxa" w:w="1500"/>
-            <w:tcBorders>
-              <w:top w:val="single" w:color="000000" w:sz="4"/>
-              <w:left w:val="single" w:color="000000" w:sz="4"/>
-              <w:bottom w:val="single" w:color="000000" w:sz="4"/>
-              <w:right w:val="single" w:color="000000" w:sz="4"/>
-            </w:tcBorders>
-            <w:tcMar>
-              <w:top w:type="dxa" w:w="80"/>
-              <w:left w:type="dxa" w:w="100"/>
-              <w:bottom w:type="dxa" w:w="80"/>
-              <w:right w:type="dxa" w:w="100"/>
-            </w:tcMar>
-          </w:tcPr>
-          <w:p>
-            <w:pPr>
-              <w:spacing w:after="0" w:line="240" w:lineRule="auto"/>
-              <w:jc w:val="center"/>
-            </w:pPr>
-            <w:r>
-              <w:rPr>
-                <w:rFonts w:ascii="Times New Roman" w:cs="Times New Roman" w:eastAsia="Times New Roman" w:hAnsi="Times New Roman"/>
-                <w:sz w:val="24"/>
-                <w:szCs w:val="24"/>
-              </w:rPr>
-              <w:t xml:space="preserve">Финал</w:t>
-            </w:r>
-          </w:p>
-        </w:tc>
-        <w:tc>
-          <w:tcPr>
-            <w:tcW w:type="dxa" w:w="3500"/>
-            <w:tcBorders>
-              <w:top w:val="single" w:color="000000" w:sz="4"/>
-              <w:left w:val="single" w:color="000000" w:sz="4"/>
-              <w:bottom w:val="single" w:color="000000" w:sz="4"/>
-              <w:right w:val="single" w:color="000000" w:sz="4"/>
-            </w:tcBorders>
-            <w:tcMar>
-              <w:top w:type="dxa" w:w="80"/>
-              <w:left w:type="dxa" w:w="100"/>
-              <w:bottom w:type="dxa" w:w="80"/>
-              <w:right w:type="dxa" w:w="100"/>
-            </w:tcMar>
-          </w:tcPr>
-          <w:p>
-            <w:pPr>
-              <w:spacing w:after="0" w:line="240" w:lineRule="auto"/>
-              <w:jc w:val="center"/>
-            </w:pPr>
-            <w:r>
-              <w:rPr>
-                <w:rFonts w:ascii="Times New Roman" w:cs="Times New Roman" w:eastAsia="Times New Roman" w:hAnsi="Times New Roman"/>
-                <w:sz w:val="24"/>
-                <w:szCs w:val="24"/>
-              </w:rPr>
-              <w:t xml:space="preserve">___</w:t>
-            </w:r>
-          </w:p>
-        </w:tc>
-        <w:tc>
-          <w:tcPr>
-            <w:tcW w:type="dxa" w:w="1500"/>
-            <w:tcBorders>
-              <w:top w:val="single" w:color="000000" w:sz="4"/>
-              <w:left w:val="single" w:color="000000" w:sz="4"/>
-              <w:bottom w:val="single" w:color="000000" w:sz="4"/>
-              <w:right w:val="single" w:color="000000" w:sz="4"/>
-            </w:tcBorders>
-            <w:tcMar>
-              <w:top w:type="dxa" w:w="80"/>
-              <w:left w:type="dxa" w:w="100"/>
-              <w:bottom w:type="dxa" w:w="80"/>
-              <w:right w:type="dxa" w:w="100"/>
-            </w:tcMar>
-          </w:tcPr>
-          <w:p>
-            <w:pPr>
-              <w:spacing w:after="0" w:line="240" w:lineRule="auto"/>
-              <w:jc w:val="center"/>
-            </w:pPr>
-            <w:r>
-              <w:rPr>
-                <w:rFonts w:ascii="Times New Roman" w:cs="Times New Roman" w:eastAsia="Times New Roman" w:hAnsi="Times New Roman"/>
-                <w:sz w:val="24"/>
-                <w:szCs w:val="24"/>
-              </w:rPr>
-              <w:t xml:space="preserve">___</w:t>
-            </w:r>
-          </w:p>
-        </w:tc>
-        <w:tc>
-          <w:tcPr>
-            <w:tcW w:type="dxa" w:w="2500"/>
-            <w:tcBorders>
-              <w:top w:val="single" w:color="000000" w:sz="4"/>
-              <w:left w:val="single" w:color="000000" w:sz="4"/>
-              <w:bottom w:val="single" w:color="000000" w:sz="4"/>
-              <w:right w:val="single" w:color="000000" w:sz="4"/>
-            </w:tcBorders>
-            <w:tcMar>
-              <w:top w:type="dxa" w:w="80"/>
-              <w:left w:type="dxa" w:w="100"/>
-              <w:bottom w:type="dxa" w:w="80"/>
-              <w:right w:type="dxa" w:w="100"/>
-            </w:tcMar>
-          </w:tcPr>
-          <w:p>
-            <w:pPr>
-              <w:spacing w:after="0" w:line="240" w:lineRule="auto"/>
-              <w:jc w:val="center"/>
-            </w:pPr>
-            <w:r>
-              <w:rPr>
-                <w:rFonts w:ascii="Times New Roman" w:cs="Times New Roman" w:eastAsia="Times New Roman" w:hAnsi="Times New Roman"/>
-                <w:sz w:val="24"/>
-                <w:szCs w:val="24"/>
-              </w:rPr>
-              <w:t xml:space="preserve">___</w:t>
+            <w:shd w:fill="FFFFFF"/>
+          </w:tcPr>
+          <w:p>
+            <w:r>
+              <w:rPr>
+                <w:rFonts w:ascii="Times New Roman" w:hAnsi="Times New Roman" w:eastAsia="Times New Roman"/>
+                <w:b w:val="0"/>
+              </w:rPr>
+              <w:t>10000</w:t>
             </w:r>
           </w:p>
         </w:tc>

</xml_diff>

<commit_message>
Improve lab result representativeness
</commit_message>
<xml_diff>
--- a/Отчёт_ЛР_RL_GOST.docx
+++ b/Отчёт_ЛР_RL_GOST.docx
@@ -2160,7 +2160,7 @@
                 <w:rFonts w:ascii="Times New Roman" w:hAnsi="Times New Roman" w:eastAsia="Times New Roman"/>
                 <w:b w:val="0"/>
               </w:rPr>
-              <w:t>22.50</w:t>
+              <w:t>21.39</w:t>
             </w:r>
           </w:p>
         </w:tc>
@@ -2231,7 +2231,7 @@
                 <w:rFonts w:ascii="Times New Roman" w:hAnsi="Times New Roman" w:eastAsia="Times New Roman"/>
                 <w:b w:val="0"/>
               </w:rPr>
-              <w:t>12.82</w:t>
+              <w:t>11.09</w:t>
             </w:r>
           </w:p>
         </w:tc>
@@ -2302,7 +2302,7 @@
                 <w:rFonts w:ascii="Times New Roman" w:hAnsi="Times New Roman" w:eastAsia="Times New Roman"/>
                 <w:b w:val="0"/>
               </w:rPr>
-              <w:t>9</w:t>
+              <w:t>8</w:t>
             </w:r>
           </w:p>
         </w:tc>
@@ -2373,7 +2373,7 @@
                 <w:rFonts w:ascii="Times New Roman" w:hAnsi="Times New Roman" w:eastAsia="Times New Roman"/>
                 <w:b w:val="0"/>
               </w:rPr>
-              <w:t>124</w:t>
+              <w:t>74</w:t>
             </w:r>
           </w:p>
         </w:tc>
@@ -2444,7 +2444,7 @@
                 <w:rFonts w:ascii="Times New Roman" w:hAnsi="Times New Roman" w:eastAsia="Times New Roman"/>
                 <w:b w:val="0"/>
               </w:rPr>
-              <w:t>0.5 %</w:t>
+              <w:t>0.0 %</w:t>
             </w:r>
           </w:p>
         </w:tc>
@@ -4189,7 +4189,7 @@
                 <w:rFonts w:ascii="Times New Roman" w:hAnsi="Times New Roman" w:eastAsia="Times New Roman"/>
                 <w:b w:val="0"/>
               </w:rPr>
-              <w:t>0.0716</w:t>
+              <w:t>0.0750</w:t>
             </w:r>
           </w:p>
         </w:tc>
@@ -4685,7 +4685,7 @@
                 <w:rFonts w:ascii="Times New Roman" w:hAnsi="Times New Roman" w:eastAsia="Times New Roman"/>
                 <w:b w:val="0"/>
               </w:rPr>
-              <w:t>639245</w:t>
+              <w:t>1889849</w:t>
             </w:r>
           </w:p>
         </w:tc>
@@ -4741,7 +4741,7 @@
                 <w:rFonts w:ascii="Times New Roman" w:hAnsi="Times New Roman" w:eastAsia="Times New Roman"/>
                 <w:b w:val="0"/>
               </w:rPr>
-              <w:t>0.0716</w:t>
+              <w:t>0.0750</w:t>
             </w:r>
           </w:p>
         </w:tc>
@@ -4768,7 +4768,7 @@
                 <w:rFonts w:ascii="Times New Roman" w:hAnsi="Times New Roman" w:eastAsia="Times New Roman"/>
                 <w:b w:val="0"/>
               </w:rPr>
-              <w:t>10.3906</w:t>
+              <w:t>31.7488</w:t>
             </w:r>
           </w:p>
         </w:tc>
@@ -4851,7 +4851,7 @@
                 <w:rFonts w:ascii="Times New Roman" w:hAnsi="Times New Roman" w:eastAsia="Times New Roman"/>
                 <w:b w:val="0"/>
               </w:rPr>
-              <w:t>55.3 %</w:t>
+              <w:t>75.2 %</w:t>
             </w:r>
           </w:p>
         </w:tc>
@@ -4934,7 +4934,7 @@
                 <w:rFonts w:ascii="Times New Roman" w:hAnsi="Times New Roman" w:eastAsia="Times New Roman"/>
                 <w:b w:val="0"/>
               </w:rPr>
-              <w:t>93.8 %</w:t>
+              <w:t>100.0 %</w:t>
             </w:r>
           </w:p>
         </w:tc>
@@ -5209,7 +5209,7 @@
                 <w:rFonts w:ascii="Times New Roman" w:hAnsi="Times New Roman" w:eastAsia="Times New Roman"/>
                 <w:b w:val="0"/>
               </w:rPr>
-              <w:t>100</w:t>
+              <w:t>50</w:t>
             </w:r>
           </w:p>
         </w:tc>
@@ -5236,7 +5236,7 @@
                 <w:rFonts w:ascii="Times New Roman" w:hAnsi="Times New Roman" w:eastAsia="Times New Roman"/>
                 <w:b w:val="0"/>
               </w:rPr>
-              <w:t>25.00</w:t>
+              <w:t>22.60</w:t>
             </w:r>
           </w:p>
         </w:tc>
@@ -5263,7 +5263,7 @@
                 <w:rFonts w:ascii="Times New Roman" w:hAnsi="Times New Roman" w:eastAsia="Times New Roman"/>
                 <w:b w:val="0"/>
               </w:rPr>
-              <w:t>0.755</w:t>
+              <w:t>0.889</w:t>
             </w:r>
           </w:p>
         </w:tc>
@@ -5290,7 +5290,7 @@
                 <w:rFonts w:ascii="Times New Roman" w:hAnsi="Times New Roman" w:eastAsia="Times New Roman"/>
                 <w:b w:val="0"/>
               </w:rPr>
-              <w:t>2500</w:t>
+              <w:t>1130</w:t>
             </w:r>
           </w:p>
         </w:tc>
@@ -5319,6 +5319,228 @@
                 <w:rFonts w:ascii="Times New Roman" w:hAnsi="Times New Roman" w:eastAsia="Times New Roman"/>
                 <w:b w:val="0"/>
               </w:rPr>
+              <w:t>100</w:t>
+            </w:r>
+          </w:p>
+        </w:tc>
+        <w:tc>
+          <w:tcPr>
+            <w:tcW w:type="dxa" w:w="3500"/>
+            <w:tcBorders>
+              <w:top w:val="single" w:color="000000" w:sz="4"/>
+              <w:left w:val="single" w:color="000000" w:sz="4"/>
+              <w:bottom w:val="single" w:color="000000" w:sz="4"/>
+              <w:right w:val="single" w:color="000000" w:sz="4"/>
+            </w:tcBorders>
+            <w:tcMar>
+              <w:top w:type="dxa" w:w="80"/>
+              <w:left w:type="dxa" w:w="100"/>
+              <w:bottom w:type="dxa" w:w="80"/>
+              <w:right w:type="dxa" w:w="100"/>
+            </w:tcMar>
+            <w:shd w:fill="FFFFFF"/>
+          </w:tcPr>
+          <w:p>
+            <w:r>
+              <w:rPr>
+                <w:rFonts w:ascii="Times New Roman" w:hAnsi="Times New Roman" w:eastAsia="Times New Roman"/>
+                <w:b w:val="0"/>
+              </w:rPr>
+              <w:t>28.02</w:t>
+            </w:r>
+          </w:p>
+        </w:tc>
+        <w:tc>
+          <w:tcPr>
+            <w:tcW w:type="dxa" w:w="1500"/>
+            <w:tcBorders>
+              <w:top w:val="single" w:color="000000" w:sz="4"/>
+              <w:left w:val="single" w:color="000000" w:sz="4"/>
+              <w:bottom w:val="single" w:color="000000" w:sz="4"/>
+              <w:right w:val="single" w:color="000000" w:sz="4"/>
+            </w:tcBorders>
+            <w:tcMar>
+              <w:top w:type="dxa" w:w="80"/>
+              <w:left w:type="dxa" w:w="100"/>
+              <w:bottom w:type="dxa" w:w="80"/>
+              <w:right w:type="dxa" w:w="100"/>
+            </w:tcMar>
+            <w:shd w:fill="FFFFFF"/>
+          </w:tcPr>
+          <w:p>
+            <w:r>
+              <w:rPr>
+                <w:rFonts w:ascii="Times New Roman" w:hAnsi="Times New Roman" w:eastAsia="Times New Roman"/>
+                <w:b w:val="0"/>
+              </w:rPr>
+              <w:t>0.726</w:t>
+            </w:r>
+          </w:p>
+        </w:tc>
+        <w:tc>
+          <w:tcPr>
+            <w:tcW w:type="dxa" w:w="2500"/>
+            <w:tcBorders>
+              <w:top w:val="single" w:color="000000" w:sz="4"/>
+              <w:left w:val="single" w:color="000000" w:sz="4"/>
+              <w:bottom w:val="single" w:color="000000" w:sz="4"/>
+              <w:right w:val="single" w:color="000000" w:sz="4"/>
+            </w:tcBorders>
+            <w:tcMar>
+              <w:top w:type="dxa" w:w="80"/>
+              <w:left w:type="dxa" w:w="100"/>
+              <w:bottom w:type="dxa" w:w="80"/>
+              <w:right w:type="dxa" w:w="100"/>
+            </w:tcMar>
+            <w:shd w:fill="FFFFFF"/>
+          </w:tcPr>
+          <w:p>
+            <w:r>
+              <w:rPr>
+                <w:rFonts w:ascii="Times New Roman" w:hAnsi="Times New Roman" w:eastAsia="Times New Roman"/>
+                <w:b w:val="0"/>
+              </w:rPr>
+              <w:t>2802</w:t>
+            </w:r>
+          </w:p>
+        </w:tc>
+      </w:tr>
+      <w:tr>
+        <w:tc>
+          <w:tcPr>
+            <w:tcW w:type="dxa" w:w="1500"/>
+            <w:shd w:fill="FFFFFF"/>
+          </w:tcPr>
+          <w:p>
+            <w:r>
+              <w:rPr>
+                <w:rFonts w:ascii="Times New Roman" w:hAnsi="Times New Roman" w:eastAsia="Times New Roman"/>
+                <w:b w:val="0"/>
+              </w:rPr>
+              <w:t>150</w:t>
+            </w:r>
+          </w:p>
+        </w:tc>
+        <w:tc>
+          <w:tcPr>
+            <w:tcW w:type="dxa" w:w="3500"/>
+            <w:shd w:fill="FFFFFF"/>
+          </w:tcPr>
+          <w:p>
+            <w:r>
+              <w:rPr>
+                <w:rFonts w:ascii="Times New Roman" w:hAnsi="Times New Roman" w:eastAsia="Times New Roman"/>
+                <w:b w:val="0"/>
+              </w:rPr>
+              <w:t>46.96</w:t>
+            </w:r>
+          </w:p>
+        </w:tc>
+        <w:tc>
+          <w:tcPr>
+            <w:tcW w:type="dxa" w:w="1500"/>
+            <w:shd w:fill="FFFFFF"/>
+          </w:tcPr>
+          <w:p>
+            <w:r>
+              <w:rPr>
+                <w:rFonts w:ascii="Times New Roman" w:hAnsi="Times New Roman" w:eastAsia="Times New Roman"/>
+                <w:b w:val="0"/>
+              </w:rPr>
+              <w:t>0.429</w:t>
+            </w:r>
+          </w:p>
+        </w:tc>
+        <w:tc>
+          <w:tcPr>
+            <w:tcW w:type="dxa" w:w="2500"/>
+            <w:shd w:fill="FFFFFF"/>
+          </w:tcPr>
+          <w:p>
+            <w:r>
+              <w:rPr>
+                <w:rFonts w:ascii="Times New Roman" w:hAnsi="Times New Roman" w:eastAsia="Times New Roman"/>
+                <w:b w:val="0"/>
+              </w:rPr>
+              <w:t>5826</w:t>
+            </w:r>
+          </w:p>
+        </w:tc>
+      </w:tr>
+      <w:tr>
+        <w:tc>
+          <w:tcPr>
+            <w:tcW w:type="dxa" w:w="1500"/>
+            <w:shd w:fill="FFFFFF"/>
+          </w:tcPr>
+          <w:p>
+            <w:r>
+              <w:rPr>
+                <w:rFonts w:ascii="Times New Roman" w:hAnsi="Times New Roman" w:eastAsia="Times New Roman"/>
+                <w:b w:val="0"/>
+              </w:rPr>
+              <w:t>200</w:t>
+            </w:r>
+          </w:p>
+        </w:tc>
+        <w:tc>
+          <w:tcPr>
+            <w:tcW w:type="dxa" w:w="3500"/>
+            <w:shd w:fill="FFFFFF"/>
+          </w:tcPr>
+          <w:p>
+            <w:r>
+              <w:rPr>
+                <w:rFonts w:ascii="Times New Roman" w:hAnsi="Times New Roman" w:eastAsia="Times New Roman"/>
+                <w:b w:val="0"/>
+              </w:rPr>
+              <w:t>113.40</w:t>
+            </w:r>
+          </w:p>
+        </w:tc>
+        <w:tc>
+          <w:tcPr>
+            <w:tcW w:type="dxa" w:w="1500"/>
+            <w:shd w:fill="FFFFFF"/>
+          </w:tcPr>
+          <w:p>
+            <w:r>
+              <w:rPr>
+                <w:rFonts w:ascii="Times New Roman" w:hAnsi="Times New Roman" w:eastAsia="Times New Roman"/>
+                <w:b w:val="0"/>
+              </w:rPr>
+              <w:t>0.020</w:t>
+            </w:r>
+          </w:p>
+        </w:tc>
+        <w:tc>
+          <w:tcPr>
+            <w:tcW w:type="dxa" w:w="2500"/>
+            <w:shd w:fill="FFFFFF"/>
+          </w:tcPr>
+          <w:p>
+            <w:r>
+              <w:rPr>
+                <w:rFonts w:ascii="Times New Roman" w:hAnsi="Times New Roman" w:eastAsia="Times New Roman"/>
+                <w:b w:val="0"/>
+              </w:rPr>
+              <w:t>10000</w:t>
+            </w:r>
+          </w:p>
+        </w:tc>
+      </w:tr>
+      <w:tr>
+        <w:tc>
+          <w:tcPr>
+            <w:tcW w:type="dxa" w:w="1500"/>
+            <w:shd w:fill="FFFFFF"/>
+          </w:tcPr>
+          <w:p>
+            <w:r>
+              <w:rPr>
+                <w:rFonts w:ascii="Times New Roman" w:hAnsi="Times New Roman" w:eastAsia="Times New Roman"/>
+                <w:b w:val="0"/>
+              </w:rPr>
               <w:t>Финал</w:t>
             </w:r>
           </w:p>
@@ -5326,45 +5548,21 @@
         <w:tc>
           <w:tcPr>
             <w:tcW w:type="dxa" w:w="3500"/>
-            <w:tcBorders>
-              <w:top w:val="single" w:color="000000" w:sz="4"/>
-              <w:left w:val="single" w:color="000000" w:sz="4"/>
-              <w:bottom w:val="single" w:color="000000" w:sz="4"/>
-              <w:right w:val="single" w:color="000000" w:sz="4"/>
-            </w:tcBorders>
-            <w:tcMar>
-              <w:top w:type="dxa" w:w="80"/>
-              <w:left w:type="dxa" w:w="100"/>
-              <w:bottom w:type="dxa" w:w="80"/>
-              <w:right w:type="dxa" w:w="100"/>
-            </w:tcMar>
-            <w:shd w:fill="FFFFFF"/>
-          </w:tcPr>
-          <w:p>
-            <w:r>
-              <w:rPr>
-                <w:rFonts w:ascii="Times New Roman" w:hAnsi="Times New Roman" w:eastAsia="Times New Roman"/>
-                <w:b w:val="0"/>
-              </w:rPr>
-              <w:t>197.10</w:t>
+            <w:shd w:fill="FFFFFF"/>
+          </w:tcPr>
+          <w:p>
+            <w:r>
+              <w:rPr>
+                <w:rFonts w:ascii="Times New Roman" w:hAnsi="Times New Roman" w:eastAsia="Times New Roman"/>
+                <w:b w:val="0"/>
+              </w:rPr>
+              <w:t>197.19</w:t>
             </w:r>
           </w:p>
         </w:tc>
         <w:tc>
           <w:tcPr>
             <w:tcW w:type="dxa" w:w="1500"/>
-            <w:tcBorders>
-              <w:top w:val="single" w:color="000000" w:sz="4"/>
-              <w:left w:val="single" w:color="000000" w:sz="4"/>
-              <w:bottom w:val="single" w:color="000000" w:sz="4"/>
-              <w:right w:val="single" w:color="000000" w:sz="4"/>
-            </w:tcBorders>
-            <w:tcMar>
-              <w:top w:type="dxa" w:w="80"/>
-              <w:left w:type="dxa" w:w="100"/>
-              <w:bottom w:type="dxa" w:w="80"/>
-              <w:right w:type="dxa" w:w="100"/>
-            </w:tcMar>
             <w:shd w:fill="FFFFFF"/>
           </w:tcPr>
           <w:p>
@@ -5380,18 +5578,6 @@
         <w:tc>
           <w:tcPr>
             <w:tcW w:type="dxa" w:w="2500"/>
-            <w:tcBorders>
-              <w:top w:val="single" w:color="000000" w:sz="4"/>
-              <w:left w:val="single" w:color="000000" w:sz="4"/>
-              <w:bottom w:val="single" w:color="000000" w:sz="4"/>
-              <w:right w:val="single" w:color="000000" w:sz="4"/>
-            </w:tcBorders>
-            <w:tcMar>
-              <w:top w:type="dxa" w:w="80"/>
-              <w:left w:type="dxa" w:w="100"/>
-              <w:bottom w:type="dxa" w:w="80"/>
-              <w:right w:type="dxa" w:w="100"/>
-            </w:tcMar>
             <w:shd w:fill="FFFFFF"/>
           </w:tcPr>
           <w:p>

</xml_diff>